<commit_message>
Atualização da documentação com a inclusão da planilha de riscos do projeto
</commit_message>
<xml_diff>
--- a/TI/FlowIT.docx
+++ b/TI/FlowIT.docx
@@ -1,6 +1,6 @@
 
 <file path=word/document.xml><?xml version="1.0" encoding="utf-8"?>
-<w:document xmlns:wpc="http://schemas.microsoft.com/office/word/2010/wordprocessingCanvas" xmlns:cx="http://schemas.microsoft.com/office/drawing/2014/chartex" xmlns:cx1="http://schemas.microsoft.com/office/drawing/2015/9/8/chartex" xmlns:cx2="http://schemas.microsoft.com/office/drawing/2015/10/21/chartex" xmlns:cx3="http://schemas.microsoft.com/office/drawing/2016/5/9/chartex" xmlns:cx4="http://schemas.microsoft.com/office/drawing/2016/5/10/chartex" xmlns:cx5="http://schemas.microsoft.com/office/drawing/2016/5/11/chartex" xmlns:cx6="http://schemas.microsoft.com/office/drawing/2016/5/12/chartex" xmlns:cx7="http://schemas.microsoft.com/office/drawing/2016/5/13/chartex" xmlns:cx8="http://schemas.microsoft.com/office/drawing/2016/5/14/chartex" xmlns:mc="http://schemas.openxmlformats.org/markup-compatibility/2006" xmlns:aink="http://schemas.microsoft.com/office/drawing/2016/ink" xmlns:am3d="http://schemas.microsoft.com/office/drawing/2017/model3d" xmlns:o="urn:schemas-microsoft-com:office:office" xmlns:oel="http://schemas.microsoft.com/office/2019/extlst" xmlns:r="http://schemas.openxmlformats.org/officeDocument/2006/relationships" xmlns:m="http://schemas.openxmlformats.org/officeDocument/2006/math" xmlns:v="urn:schemas-microsoft-com:vml" xmlns:wp14="http://schemas.microsoft.com/office/word/2010/wordprocessingDrawing" xmlns:wp="http://schemas.openxmlformats.org/drawingml/2006/wordprocessingDrawing" xmlns:w10="urn:schemas-microsoft-com:office:word" xmlns:w="http://schemas.openxmlformats.org/wordprocessingml/2006/main" xmlns:w14="http://schemas.microsoft.com/office/word/2010/wordml" xmlns:w15="http://schemas.microsoft.com/office/word/2012/wordml" xmlns:w16cex="http://schemas.microsoft.com/office/word/2018/wordml/cex" xmlns:w16cid="http://schemas.microsoft.com/office/word/2016/wordml/cid" xmlns:w16="http://schemas.microsoft.com/office/word/2018/wordml" xmlns:w16du="http://schemas.microsoft.com/office/word/2023/wordml/word16du" xmlns:w16sdtdh="http://schemas.microsoft.com/office/word/2020/wordml/sdtdatahash" xmlns:w16sdtfl="http://schemas.microsoft.com/office/word/2024/wordml/sdtformatlock" xmlns:w16se="http://schemas.microsoft.com/office/word/2015/wordml/symex" xmlns:wpg="http://schemas.microsoft.com/office/word/2010/wordprocessingGroup" xmlns:wpi="http://schemas.microsoft.com/office/word/2010/wordprocessingInk" xmlns:wne="http://schemas.microsoft.com/office/word/2006/wordml" xmlns:wps="http://schemas.microsoft.com/office/word/2010/wordprocessingShape" mc:Ignorable="w14 w15 w16se w16cid w16 w16cex w16sdtdh w16sdtfl w16du wp14">
+<w:document xmlns:wpc="http://schemas.microsoft.com/office/word/2010/wordprocessingCanvas" xmlns:cx="http://schemas.microsoft.com/office/drawing/2014/chartex" xmlns:cx1="http://schemas.microsoft.com/office/drawing/2015/9/8/chartex" xmlns:cx2="http://schemas.microsoft.com/office/drawing/2015/10/21/chartex" xmlns:cx3="http://schemas.microsoft.com/office/drawing/2016/5/9/chartex" xmlns:cx4="http://schemas.microsoft.com/office/drawing/2016/5/10/chartex" xmlns:cx5="http://schemas.microsoft.com/office/drawing/2016/5/11/chartex" xmlns:cx6="http://schemas.microsoft.com/office/drawing/2016/5/12/chartex" xmlns:cx7="http://schemas.microsoft.com/office/drawing/2016/5/13/chartex" xmlns:cx8="http://schemas.microsoft.com/office/drawing/2016/5/14/chartex" xmlns:mc="http://schemas.openxmlformats.org/markup-compatibility/2006" xmlns:aink="http://schemas.microsoft.com/office/drawing/2016/ink" xmlns:am3d="http://schemas.microsoft.com/office/drawing/2017/model3d" xmlns:o="urn:schemas-microsoft-com:office:office" xmlns:oel="http://schemas.microsoft.com/office/2019/extlst" xmlns:r="http://schemas.openxmlformats.org/officeDocument/2006/relationships" xmlns:m="http://schemas.openxmlformats.org/officeDocument/2006/math" xmlns:v="urn:schemas-microsoft-com:vml" xmlns:wp14="http://schemas.microsoft.com/office/word/2010/wordprocessingDrawing" xmlns:wp="http://schemas.openxmlformats.org/drawingml/2006/wordprocessingDrawing" xmlns:w10="urn:schemas-microsoft-com:office:word" xmlns:w="http://schemas.openxmlformats.org/wordprocessingml/2006/main" xmlns:w14="http://schemas.microsoft.com/office/word/2010/wordml" xmlns:w15="http://schemas.microsoft.com/office/word/2012/wordml" xmlns:w16cex="http://schemas.microsoft.com/office/word/2018/wordml/cex" xmlns:w16cid="http://schemas.microsoft.com/office/word/2016/wordml/cid" xmlns:w16="http://schemas.microsoft.com/office/word/2018/wordml" xmlns:w16sdtdh="http://schemas.microsoft.com/office/word/2020/wordml/sdtdatahash" xmlns:w16se="http://schemas.microsoft.com/office/word/2015/wordml/symex" xmlns:wpg="http://schemas.microsoft.com/office/word/2010/wordprocessingGroup" xmlns:wpi="http://schemas.microsoft.com/office/word/2010/wordprocessingInk" xmlns:wne="http://schemas.microsoft.com/office/word/2006/wordml" xmlns:wps="http://schemas.microsoft.com/office/word/2010/wordprocessingShape" mc:Ignorable="w14 w15 w16se w16cid w16 w16cex w16sdtdh wp14">
   <w:body>
     <w:p>
       <w:pPr>
@@ -299,6 +299,15 @@
     </w:p>
     <w:sdt>
       <w:sdtPr>
+        <w:rPr>
+          <w:rFonts w:ascii="Times New Roman" w:eastAsiaTheme="minorHAnsi" w:hAnsi="Times New Roman" w:cstheme="minorBidi"/>
+          <w:color w:val="auto"/>
+          <w:kern w:val="2"/>
+          <w:sz w:val="24"/>
+          <w:szCs w:val="24"/>
+          <w:lang w:eastAsia="en-US"/>
+          <w14:ligatures w14:val="standardContextual"/>
+        </w:rPr>
         <w:id w:val="802273697"/>
         <w:docPartObj>
           <w:docPartGallery w:val="Table of Contents"/>
@@ -307,15 +316,8 @@
       </w:sdtPr>
       <w:sdtEndPr>
         <w:rPr>
-          <w:rFonts w:ascii="Times New Roman" w:eastAsiaTheme="minorHAnsi" w:hAnsi="Times New Roman" w:cstheme="minorBidi"/>
           <w:b/>
           <w:bCs/>
-          <w:color w:val="auto"/>
-          <w:kern w:val="2"/>
-          <w:sz w:val="24"/>
-          <w:szCs w:val="24"/>
-          <w:lang w:eastAsia="en-US"/>
-          <w14:ligatures w14:val="standardContextual"/>
         </w:rPr>
       </w:sdtEndPr>
       <w:sdtContent>
@@ -1403,21 +1405,7 @@
                 <w:rStyle w:val="Hyperlink"/>
                 <w:noProof/>
               </w:rPr>
-              <w:t>Premissas /</w:t>
-            </w:r>
-            <w:r>
-              <w:rPr>
-                <w:rStyle w:val="Hyperlink"/>
-                <w:noProof/>
-              </w:rPr>
-              <w:t xml:space="preserve"> </w:t>
-            </w:r>
-            <w:r>
-              <w:rPr>
-                <w:rStyle w:val="Hyperlink"/>
-                <w:noProof/>
-              </w:rPr>
-              <w:t>Restrições</w:t>
+              <w:t>Premissas / Restrições</w:t>
             </w:r>
             <w:r>
               <w:rPr>
@@ -6953,6 +6941,2912 @@
       </w:pPr>
       <w:r>
         <w:lastRenderedPageBreak/>
+        <w:t>PLANILHA DE RISCO</w:t>
+      </w:r>
+    </w:p>
+    <w:tbl>
+      <w:tblPr>
+        <w:tblW w:w="9060" w:type="dxa"/>
+        <w:tblCellMar>
+          <w:left w:w="70" w:type="dxa"/>
+          <w:right w:w="70" w:type="dxa"/>
+        </w:tblCellMar>
+        <w:tblLook w:val="04A0" w:firstRow="1" w:lastRow="0" w:firstColumn="1" w:lastColumn="0" w:noHBand="0" w:noVBand="1"/>
+      </w:tblPr>
+      <w:tblGrid>
+        <w:gridCol w:w="580"/>
+        <w:gridCol w:w="2320"/>
+        <w:gridCol w:w="1362"/>
+        <w:gridCol w:w="869"/>
+        <w:gridCol w:w="800"/>
+        <w:gridCol w:w="780"/>
+        <w:gridCol w:w="2500"/>
+      </w:tblGrid>
+      <w:tr>
+        <w:trPr>
+          <w:trHeight w:val="960"/>
+        </w:trPr>
+        <w:tc>
+          <w:tcPr>
+            <w:tcW w:w="580" w:type="dxa"/>
+            <w:tcBorders>
+              <w:top w:val="single" w:sz="8" w:space="0" w:color="auto"/>
+              <w:left w:val="single" w:sz="8" w:space="0" w:color="auto"/>
+              <w:bottom w:val="single" w:sz="4" w:space="0" w:color="auto"/>
+              <w:right w:val="single" w:sz="4" w:space="0" w:color="auto"/>
+            </w:tcBorders>
+            <w:shd w:val="clear" w:color="000000" w:fill="DAE9F8"/>
+            <w:noWrap/>
+            <w:vAlign w:val="center"/>
+            <w:hideMark/>
+          </w:tcPr>
+          <w:p>
+            <w:pPr>
+              <w:spacing w:after="0" w:line="240" w:lineRule="auto"/>
+              <w:ind w:firstLine="0"/>
+              <w:jc w:val="center"/>
+              <w:rPr>
+                <w:rFonts w:ascii="Aptos Narrow" w:eastAsia="Times New Roman" w:hAnsi="Aptos Narrow" w:cs="Times New Roman"/>
+                <w:color w:val="000000"/>
+                <w:kern w:val="0"/>
+                <w:sz w:val="22"/>
+                <w:szCs w:val="22"/>
+                <w:lang w:eastAsia="pt-BR"/>
+                <w14:ligatures w14:val="none"/>
+              </w:rPr>
+            </w:pPr>
+            <w:r>
+              <w:rPr>
+                <w:rFonts w:ascii="Aptos Narrow" w:eastAsia="Times New Roman" w:hAnsi="Aptos Narrow" w:cs="Times New Roman"/>
+                <w:color w:val="000000"/>
+                <w:kern w:val="0"/>
+                <w:sz w:val="22"/>
+                <w:szCs w:val="22"/>
+                <w:lang w:eastAsia="pt-BR"/>
+                <w14:ligatures w14:val="none"/>
+              </w:rPr>
+              <w:t>ID</w:t>
+            </w:r>
+          </w:p>
+        </w:tc>
+        <w:tc>
+          <w:tcPr>
+            <w:tcW w:w="2320" w:type="dxa"/>
+            <w:tcBorders>
+              <w:top w:val="single" w:sz="8" w:space="0" w:color="auto"/>
+              <w:left w:val="nil"/>
+              <w:bottom w:val="single" w:sz="4" w:space="0" w:color="auto"/>
+              <w:right w:val="single" w:sz="4" w:space="0" w:color="auto"/>
+            </w:tcBorders>
+            <w:shd w:val="clear" w:color="000000" w:fill="DAE9F8"/>
+            <w:noWrap/>
+            <w:vAlign w:val="center"/>
+            <w:hideMark/>
+          </w:tcPr>
+          <w:p>
+            <w:pPr>
+              <w:spacing w:after="0" w:line="240" w:lineRule="auto"/>
+              <w:ind w:firstLine="0"/>
+              <w:jc w:val="center"/>
+              <w:rPr>
+                <w:rFonts w:ascii="Aptos Narrow" w:eastAsia="Times New Roman" w:hAnsi="Aptos Narrow" w:cs="Times New Roman"/>
+                <w:color w:val="000000"/>
+                <w:kern w:val="0"/>
+                <w:sz w:val="22"/>
+                <w:szCs w:val="22"/>
+                <w:lang w:eastAsia="pt-BR"/>
+                <w14:ligatures w14:val="none"/>
+              </w:rPr>
+            </w:pPr>
+            <w:r>
+              <w:rPr>
+                <w:rFonts w:ascii="Aptos Narrow" w:eastAsia="Times New Roman" w:hAnsi="Aptos Narrow" w:cs="Times New Roman"/>
+                <w:color w:val="000000"/>
+                <w:kern w:val="0"/>
+                <w:sz w:val="22"/>
+                <w:szCs w:val="22"/>
+                <w:lang w:eastAsia="pt-BR"/>
+                <w14:ligatures w14:val="none"/>
+              </w:rPr>
+              <w:t>Descrição do Risco</w:t>
+            </w:r>
+          </w:p>
+        </w:tc>
+        <w:tc>
+          <w:tcPr>
+            <w:tcW w:w="1280" w:type="dxa"/>
+            <w:tcBorders>
+              <w:top w:val="single" w:sz="8" w:space="0" w:color="auto"/>
+              <w:left w:val="nil"/>
+              <w:bottom w:val="single" w:sz="4" w:space="0" w:color="auto"/>
+              <w:right w:val="single" w:sz="4" w:space="0" w:color="auto"/>
+            </w:tcBorders>
+            <w:shd w:val="clear" w:color="000000" w:fill="DAE9F8"/>
+            <w:vAlign w:val="center"/>
+            <w:hideMark/>
+          </w:tcPr>
+          <w:p>
+            <w:pPr>
+              <w:spacing w:after="0" w:line="240" w:lineRule="auto"/>
+              <w:ind w:firstLine="0"/>
+              <w:jc w:val="center"/>
+              <w:rPr>
+                <w:rFonts w:ascii="Aptos Narrow" w:eastAsia="Times New Roman" w:hAnsi="Aptos Narrow" w:cs="Times New Roman"/>
+                <w:color w:val="000000"/>
+                <w:kern w:val="0"/>
+                <w:sz w:val="22"/>
+                <w:szCs w:val="22"/>
+                <w:lang w:eastAsia="pt-BR"/>
+                <w14:ligatures w14:val="none"/>
+              </w:rPr>
+            </w:pPr>
+            <w:r>
+              <w:rPr>
+                <w:rFonts w:ascii="Aptos Narrow" w:eastAsia="Times New Roman" w:hAnsi="Aptos Narrow" w:cs="Times New Roman"/>
+                <w:color w:val="000000"/>
+                <w:kern w:val="0"/>
+                <w:sz w:val="22"/>
+                <w:szCs w:val="22"/>
+                <w:lang w:eastAsia="pt-BR"/>
+                <w14:ligatures w14:val="none"/>
+              </w:rPr>
+              <w:t>Probabilidade</w:t>
+            </w:r>
+          </w:p>
+        </w:tc>
+        <w:tc>
+          <w:tcPr>
+            <w:tcW w:w="800" w:type="dxa"/>
+            <w:tcBorders>
+              <w:top w:val="single" w:sz="8" w:space="0" w:color="auto"/>
+              <w:left w:val="nil"/>
+              <w:bottom w:val="single" w:sz="4" w:space="0" w:color="auto"/>
+              <w:right w:val="single" w:sz="4" w:space="0" w:color="auto"/>
+            </w:tcBorders>
+            <w:shd w:val="clear" w:color="000000" w:fill="DAE9F8"/>
+            <w:noWrap/>
+            <w:vAlign w:val="center"/>
+            <w:hideMark/>
+          </w:tcPr>
+          <w:p>
+            <w:pPr>
+              <w:spacing w:after="0" w:line="240" w:lineRule="auto"/>
+              <w:ind w:firstLine="0"/>
+              <w:jc w:val="center"/>
+              <w:rPr>
+                <w:rFonts w:ascii="Aptos Narrow" w:eastAsia="Times New Roman" w:hAnsi="Aptos Narrow" w:cs="Times New Roman"/>
+                <w:color w:val="000000"/>
+                <w:kern w:val="0"/>
+                <w:sz w:val="22"/>
+                <w:szCs w:val="22"/>
+                <w:lang w:eastAsia="pt-BR"/>
+                <w14:ligatures w14:val="none"/>
+              </w:rPr>
+            </w:pPr>
+            <w:r>
+              <w:rPr>
+                <w:rFonts w:ascii="Aptos Narrow" w:eastAsia="Times New Roman" w:hAnsi="Aptos Narrow" w:cs="Times New Roman"/>
+                <w:color w:val="000000"/>
+                <w:kern w:val="0"/>
+                <w:sz w:val="22"/>
+                <w:szCs w:val="22"/>
+                <w:lang w:eastAsia="pt-BR"/>
+                <w14:ligatures w14:val="none"/>
+              </w:rPr>
+              <w:t>Impacto</w:t>
+            </w:r>
+          </w:p>
+        </w:tc>
+        <w:tc>
+          <w:tcPr>
+            <w:tcW w:w="800" w:type="dxa"/>
+            <w:tcBorders>
+              <w:top w:val="single" w:sz="8" w:space="0" w:color="auto"/>
+              <w:left w:val="nil"/>
+              <w:bottom w:val="single" w:sz="4" w:space="0" w:color="auto"/>
+              <w:right w:val="single" w:sz="4" w:space="0" w:color="auto"/>
+            </w:tcBorders>
+            <w:shd w:val="clear" w:color="000000" w:fill="DAE9F8"/>
+            <w:vAlign w:val="center"/>
+            <w:hideMark/>
+          </w:tcPr>
+          <w:p>
+            <w:pPr>
+              <w:spacing w:after="0" w:line="240" w:lineRule="auto"/>
+              <w:ind w:firstLine="0"/>
+              <w:jc w:val="center"/>
+              <w:rPr>
+                <w:rFonts w:ascii="Aptos Narrow" w:eastAsia="Times New Roman" w:hAnsi="Aptos Narrow" w:cs="Times New Roman"/>
+                <w:color w:val="000000"/>
+                <w:kern w:val="0"/>
+                <w:sz w:val="22"/>
+                <w:szCs w:val="22"/>
+                <w:lang w:eastAsia="pt-BR"/>
+                <w14:ligatures w14:val="none"/>
+              </w:rPr>
+            </w:pPr>
+            <w:r>
+              <w:rPr>
+                <w:rFonts w:ascii="Aptos Narrow" w:eastAsia="Times New Roman" w:hAnsi="Aptos Narrow" w:cs="Times New Roman"/>
+                <w:color w:val="000000"/>
+                <w:kern w:val="0"/>
+                <w:sz w:val="22"/>
+                <w:szCs w:val="22"/>
+                <w:lang w:eastAsia="pt-BR"/>
+                <w14:ligatures w14:val="none"/>
+              </w:rPr>
+              <w:t>Fator de Risco (</w:t>
+            </w:r>
+            <w:proofErr w:type="spellStart"/>
+            <w:r>
+              <w:rPr>
+                <w:rFonts w:ascii="Aptos Narrow" w:eastAsia="Times New Roman" w:hAnsi="Aptos Narrow" w:cs="Times New Roman"/>
+                <w:color w:val="000000"/>
+                <w:kern w:val="0"/>
+                <w:sz w:val="22"/>
+                <w:szCs w:val="22"/>
+                <w:lang w:eastAsia="pt-BR"/>
+                <w14:ligatures w14:val="none"/>
+              </w:rPr>
+              <w:t>PxI</w:t>
+            </w:r>
+            <w:proofErr w:type="spellEnd"/>
+            <w:r>
+              <w:rPr>
+                <w:rFonts w:ascii="Aptos Narrow" w:eastAsia="Times New Roman" w:hAnsi="Aptos Narrow" w:cs="Times New Roman"/>
+                <w:color w:val="000000"/>
+                <w:kern w:val="0"/>
+                <w:sz w:val="22"/>
+                <w:szCs w:val="22"/>
+                <w:lang w:eastAsia="pt-BR"/>
+                <w14:ligatures w14:val="none"/>
+              </w:rPr>
+              <w:t>)</w:t>
+            </w:r>
+          </w:p>
+        </w:tc>
+        <w:tc>
+          <w:tcPr>
+            <w:tcW w:w="780" w:type="dxa"/>
+            <w:tcBorders>
+              <w:top w:val="single" w:sz="8" w:space="0" w:color="auto"/>
+              <w:left w:val="nil"/>
+              <w:bottom w:val="single" w:sz="4" w:space="0" w:color="auto"/>
+              <w:right w:val="single" w:sz="4" w:space="0" w:color="auto"/>
+            </w:tcBorders>
+            <w:shd w:val="clear" w:color="000000" w:fill="DAE9F8"/>
+            <w:noWrap/>
+            <w:vAlign w:val="center"/>
+            <w:hideMark/>
+          </w:tcPr>
+          <w:p>
+            <w:pPr>
+              <w:spacing w:after="0" w:line="240" w:lineRule="auto"/>
+              <w:ind w:firstLine="0"/>
+              <w:jc w:val="center"/>
+              <w:rPr>
+                <w:rFonts w:ascii="Aptos Narrow" w:eastAsia="Times New Roman" w:hAnsi="Aptos Narrow" w:cs="Times New Roman"/>
+                <w:color w:val="000000"/>
+                <w:kern w:val="0"/>
+                <w:sz w:val="22"/>
+                <w:szCs w:val="22"/>
+                <w:lang w:eastAsia="pt-BR"/>
+                <w14:ligatures w14:val="none"/>
+              </w:rPr>
+            </w:pPr>
+            <w:r>
+              <w:rPr>
+                <w:rFonts w:ascii="Aptos Narrow" w:eastAsia="Times New Roman" w:hAnsi="Aptos Narrow" w:cs="Times New Roman"/>
+                <w:color w:val="000000"/>
+                <w:kern w:val="0"/>
+                <w:sz w:val="22"/>
+                <w:szCs w:val="22"/>
+                <w:lang w:eastAsia="pt-BR"/>
+                <w14:ligatures w14:val="none"/>
+              </w:rPr>
+              <w:t>Ação</w:t>
+            </w:r>
+          </w:p>
+        </w:tc>
+        <w:tc>
+          <w:tcPr>
+            <w:tcW w:w="2500" w:type="dxa"/>
+            <w:tcBorders>
+              <w:top w:val="single" w:sz="8" w:space="0" w:color="auto"/>
+              <w:left w:val="nil"/>
+              <w:bottom w:val="single" w:sz="4" w:space="0" w:color="auto"/>
+              <w:right w:val="single" w:sz="8" w:space="0" w:color="000000"/>
+            </w:tcBorders>
+            <w:shd w:val="clear" w:color="000000" w:fill="DAE9F8"/>
+            <w:noWrap/>
+            <w:vAlign w:val="center"/>
+            <w:hideMark/>
+          </w:tcPr>
+          <w:p>
+            <w:pPr>
+              <w:spacing w:after="0" w:line="240" w:lineRule="auto"/>
+              <w:ind w:firstLine="0"/>
+              <w:jc w:val="center"/>
+              <w:rPr>
+                <w:rFonts w:ascii="Aptos Narrow" w:eastAsia="Times New Roman" w:hAnsi="Aptos Narrow" w:cs="Times New Roman"/>
+                <w:color w:val="000000"/>
+                <w:kern w:val="0"/>
+                <w:sz w:val="22"/>
+                <w:szCs w:val="22"/>
+                <w:lang w:eastAsia="pt-BR"/>
+                <w14:ligatures w14:val="none"/>
+              </w:rPr>
+            </w:pPr>
+            <w:r>
+              <w:rPr>
+                <w:rFonts w:ascii="Aptos Narrow" w:eastAsia="Times New Roman" w:hAnsi="Aptos Narrow" w:cs="Times New Roman"/>
+                <w:color w:val="000000"/>
+                <w:kern w:val="0"/>
+                <w:sz w:val="22"/>
+                <w:szCs w:val="22"/>
+                <w:lang w:eastAsia="pt-BR"/>
+                <w14:ligatures w14:val="none"/>
+              </w:rPr>
+              <w:t>Como?</w:t>
+            </w:r>
+          </w:p>
+        </w:tc>
+      </w:tr>
+      <w:tr>
+        <w:trPr>
+          <w:trHeight w:val="336"/>
+        </w:trPr>
+        <w:tc>
+          <w:tcPr>
+            <w:tcW w:w="580" w:type="dxa"/>
+            <w:tcBorders>
+              <w:top w:val="nil"/>
+              <w:left w:val="single" w:sz="8" w:space="0" w:color="auto"/>
+              <w:bottom w:val="single" w:sz="4" w:space="0" w:color="auto"/>
+              <w:right w:val="single" w:sz="4" w:space="0" w:color="auto"/>
+            </w:tcBorders>
+            <w:shd w:val="clear" w:color="auto" w:fill="auto"/>
+            <w:noWrap/>
+            <w:vAlign w:val="center"/>
+            <w:hideMark/>
+          </w:tcPr>
+          <w:p>
+            <w:pPr>
+              <w:spacing w:after="0" w:line="240" w:lineRule="auto"/>
+              <w:ind w:firstLine="0"/>
+              <w:jc w:val="center"/>
+              <w:rPr>
+                <w:rFonts w:ascii="Aptos Narrow" w:eastAsia="Times New Roman" w:hAnsi="Aptos Narrow" w:cs="Times New Roman"/>
+                <w:color w:val="000000"/>
+                <w:kern w:val="0"/>
+                <w:sz w:val="22"/>
+                <w:szCs w:val="22"/>
+                <w:lang w:eastAsia="pt-BR"/>
+                <w14:ligatures w14:val="none"/>
+              </w:rPr>
+            </w:pPr>
+            <w:r>
+              <w:rPr>
+                <w:rFonts w:ascii="Aptos Narrow" w:eastAsia="Times New Roman" w:hAnsi="Aptos Narrow" w:cs="Times New Roman"/>
+                <w:color w:val="000000"/>
+                <w:kern w:val="0"/>
+                <w:sz w:val="22"/>
+                <w:szCs w:val="22"/>
+                <w:lang w:eastAsia="pt-BR"/>
+                <w14:ligatures w14:val="none"/>
+              </w:rPr>
+              <w:t>1</w:t>
+            </w:r>
+          </w:p>
+        </w:tc>
+        <w:tc>
+          <w:tcPr>
+            <w:tcW w:w="2320" w:type="dxa"/>
+            <w:tcBorders>
+              <w:top w:val="single" w:sz="4" w:space="0" w:color="auto"/>
+              <w:left w:val="nil"/>
+              <w:bottom w:val="single" w:sz="4" w:space="0" w:color="auto"/>
+              <w:right w:val="single" w:sz="4" w:space="0" w:color="auto"/>
+            </w:tcBorders>
+            <w:shd w:val="clear" w:color="auto" w:fill="auto"/>
+            <w:vAlign w:val="center"/>
+            <w:hideMark/>
+          </w:tcPr>
+          <w:p>
+            <w:pPr>
+              <w:spacing w:after="0" w:line="240" w:lineRule="auto"/>
+              <w:ind w:firstLine="0"/>
+              <w:jc w:val="left"/>
+              <w:rPr>
+                <w:rFonts w:ascii="Aptos Narrow" w:eastAsia="Times New Roman" w:hAnsi="Aptos Narrow" w:cs="Times New Roman"/>
+                <w:color w:val="000000"/>
+                <w:kern w:val="0"/>
+                <w:sz w:val="22"/>
+                <w:szCs w:val="22"/>
+                <w:lang w:eastAsia="pt-BR"/>
+                <w14:ligatures w14:val="none"/>
+              </w:rPr>
+            </w:pPr>
+            <w:r>
+              <w:rPr>
+                <w:rFonts w:ascii="Aptos Narrow" w:eastAsia="Times New Roman" w:hAnsi="Aptos Narrow" w:cs="Times New Roman"/>
+                <w:color w:val="000000"/>
+                <w:kern w:val="0"/>
+                <w:sz w:val="22"/>
+                <w:szCs w:val="22"/>
+                <w:lang w:eastAsia="pt-BR"/>
+                <w14:ligatures w14:val="none"/>
+              </w:rPr>
+              <w:t>Perder um integrante</w:t>
+            </w:r>
+          </w:p>
+        </w:tc>
+        <w:tc>
+          <w:tcPr>
+            <w:tcW w:w="1280" w:type="dxa"/>
+            <w:tcBorders>
+              <w:top w:val="single" w:sz="4" w:space="0" w:color="auto"/>
+              <w:left w:val="nil"/>
+              <w:bottom w:val="single" w:sz="4" w:space="0" w:color="auto"/>
+              <w:right w:val="single" w:sz="4" w:space="0" w:color="auto"/>
+            </w:tcBorders>
+            <w:shd w:val="clear" w:color="auto" w:fill="auto"/>
+            <w:noWrap/>
+            <w:vAlign w:val="center"/>
+            <w:hideMark/>
+          </w:tcPr>
+          <w:p>
+            <w:pPr>
+              <w:spacing w:after="0" w:line="240" w:lineRule="auto"/>
+              <w:ind w:firstLine="0"/>
+              <w:jc w:val="center"/>
+              <w:rPr>
+                <w:rFonts w:ascii="Aptos Narrow" w:eastAsia="Times New Roman" w:hAnsi="Aptos Narrow" w:cs="Times New Roman"/>
+                <w:color w:val="000000"/>
+                <w:kern w:val="0"/>
+                <w:sz w:val="22"/>
+                <w:szCs w:val="22"/>
+                <w:lang w:eastAsia="pt-BR"/>
+                <w14:ligatures w14:val="none"/>
+              </w:rPr>
+            </w:pPr>
+            <w:r>
+              <w:rPr>
+                <w:rFonts w:ascii="Aptos Narrow" w:eastAsia="Times New Roman" w:hAnsi="Aptos Narrow" w:cs="Times New Roman"/>
+                <w:color w:val="000000"/>
+                <w:kern w:val="0"/>
+                <w:sz w:val="22"/>
+                <w:szCs w:val="22"/>
+                <w:lang w:eastAsia="pt-BR"/>
+                <w14:ligatures w14:val="none"/>
+              </w:rPr>
+              <w:t>1</w:t>
+            </w:r>
+          </w:p>
+        </w:tc>
+        <w:tc>
+          <w:tcPr>
+            <w:tcW w:w="800" w:type="dxa"/>
+            <w:tcBorders>
+              <w:top w:val="single" w:sz="4" w:space="0" w:color="auto"/>
+              <w:left w:val="nil"/>
+              <w:bottom w:val="single" w:sz="4" w:space="0" w:color="auto"/>
+              <w:right w:val="single" w:sz="4" w:space="0" w:color="auto"/>
+            </w:tcBorders>
+            <w:shd w:val="clear" w:color="auto" w:fill="auto"/>
+            <w:noWrap/>
+            <w:vAlign w:val="center"/>
+            <w:hideMark/>
+          </w:tcPr>
+          <w:p>
+            <w:pPr>
+              <w:spacing w:after="0" w:line="240" w:lineRule="auto"/>
+              <w:ind w:firstLine="0"/>
+              <w:jc w:val="center"/>
+              <w:rPr>
+                <w:rFonts w:ascii="Aptos Narrow" w:eastAsia="Times New Roman" w:hAnsi="Aptos Narrow" w:cs="Times New Roman"/>
+                <w:color w:val="000000"/>
+                <w:kern w:val="0"/>
+                <w:sz w:val="22"/>
+                <w:szCs w:val="22"/>
+                <w:lang w:eastAsia="pt-BR"/>
+                <w14:ligatures w14:val="none"/>
+              </w:rPr>
+            </w:pPr>
+            <w:r>
+              <w:rPr>
+                <w:rFonts w:ascii="Aptos Narrow" w:eastAsia="Times New Roman" w:hAnsi="Aptos Narrow" w:cs="Times New Roman"/>
+                <w:color w:val="000000"/>
+                <w:kern w:val="0"/>
+                <w:sz w:val="22"/>
+                <w:szCs w:val="22"/>
+                <w:lang w:eastAsia="pt-BR"/>
+                <w14:ligatures w14:val="none"/>
+              </w:rPr>
+              <w:t>3</w:t>
+            </w:r>
+          </w:p>
+        </w:tc>
+        <w:tc>
+          <w:tcPr>
+            <w:tcW w:w="800" w:type="dxa"/>
+            <w:tcBorders>
+              <w:top w:val="single" w:sz="4" w:space="0" w:color="auto"/>
+              <w:left w:val="nil"/>
+              <w:bottom w:val="single" w:sz="4" w:space="0" w:color="auto"/>
+              <w:right w:val="single" w:sz="4" w:space="0" w:color="auto"/>
+            </w:tcBorders>
+            <w:shd w:val="clear" w:color="auto" w:fill="auto"/>
+            <w:noWrap/>
+            <w:vAlign w:val="center"/>
+            <w:hideMark/>
+          </w:tcPr>
+          <w:p>
+            <w:pPr>
+              <w:spacing w:after="0" w:line="240" w:lineRule="auto"/>
+              <w:ind w:firstLine="0"/>
+              <w:jc w:val="center"/>
+              <w:rPr>
+                <w:rFonts w:ascii="Aptos Narrow" w:eastAsia="Times New Roman" w:hAnsi="Aptos Narrow" w:cs="Times New Roman"/>
+                <w:color w:val="000000"/>
+                <w:kern w:val="0"/>
+                <w:sz w:val="22"/>
+                <w:szCs w:val="22"/>
+                <w:lang w:eastAsia="pt-BR"/>
+                <w14:ligatures w14:val="none"/>
+              </w:rPr>
+            </w:pPr>
+            <w:r>
+              <w:rPr>
+                <w:rFonts w:ascii="Aptos Narrow" w:eastAsia="Times New Roman" w:hAnsi="Aptos Narrow" w:cs="Times New Roman"/>
+                <w:color w:val="000000"/>
+                <w:kern w:val="0"/>
+                <w:sz w:val="22"/>
+                <w:szCs w:val="22"/>
+                <w:lang w:eastAsia="pt-BR"/>
+                <w14:ligatures w14:val="none"/>
+              </w:rPr>
+              <w:t>3</w:t>
+            </w:r>
+          </w:p>
+        </w:tc>
+        <w:tc>
+          <w:tcPr>
+            <w:tcW w:w="780" w:type="dxa"/>
+            <w:tcBorders>
+              <w:top w:val="nil"/>
+              <w:left w:val="nil"/>
+              <w:bottom w:val="single" w:sz="4" w:space="0" w:color="auto"/>
+              <w:right w:val="single" w:sz="4" w:space="0" w:color="auto"/>
+            </w:tcBorders>
+            <w:shd w:val="clear" w:color="auto" w:fill="auto"/>
+            <w:noWrap/>
+            <w:vAlign w:val="center"/>
+            <w:hideMark/>
+          </w:tcPr>
+          <w:p>
+            <w:pPr>
+              <w:spacing w:after="0" w:line="240" w:lineRule="auto"/>
+              <w:ind w:firstLine="0"/>
+              <w:jc w:val="center"/>
+              <w:rPr>
+                <w:rFonts w:ascii="Aptos Narrow" w:eastAsia="Times New Roman" w:hAnsi="Aptos Narrow" w:cs="Times New Roman"/>
+                <w:color w:val="000000"/>
+                <w:kern w:val="0"/>
+                <w:sz w:val="22"/>
+                <w:szCs w:val="22"/>
+                <w:lang w:eastAsia="pt-BR"/>
+                <w14:ligatures w14:val="none"/>
+              </w:rPr>
+            </w:pPr>
+            <w:r>
+              <w:rPr>
+                <w:rFonts w:ascii="Aptos Narrow" w:eastAsia="Times New Roman" w:hAnsi="Aptos Narrow" w:cs="Times New Roman"/>
+                <w:color w:val="000000"/>
+                <w:kern w:val="0"/>
+                <w:sz w:val="22"/>
+                <w:szCs w:val="22"/>
+                <w:lang w:eastAsia="pt-BR"/>
+                <w14:ligatures w14:val="none"/>
+              </w:rPr>
+              <w:t>Mitigar</w:t>
+            </w:r>
+          </w:p>
+        </w:tc>
+        <w:tc>
+          <w:tcPr>
+            <w:tcW w:w="2500" w:type="dxa"/>
+            <w:tcBorders>
+              <w:top w:val="single" w:sz="4" w:space="0" w:color="auto"/>
+              <w:left w:val="nil"/>
+              <w:bottom w:val="single" w:sz="4" w:space="0" w:color="auto"/>
+              <w:right w:val="single" w:sz="8" w:space="0" w:color="000000"/>
+            </w:tcBorders>
+            <w:shd w:val="clear" w:color="auto" w:fill="auto"/>
+            <w:noWrap/>
+            <w:vAlign w:val="center"/>
+            <w:hideMark/>
+          </w:tcPr>
+          <w:p>
+            <w:pPr>
+              <w:spacing w:after="0" w:line="240" w:lineRule="auto"/>
+              <w:ind w:firstLine="0"/>
+              <w:rPr>
+                <w:rFonts w:ascii="Aptos Narrow" w:eastAsia="Times New Roman" w:hAnsi="Aptos Narrow" w:cs="Times New Roman"/>
+                <w:color w:val="000000"/>
+                <w:kern w:val="0"/>
+                <w:sz w:val="22"/>
+                <w:szCs w:val="22"/>
+                <w:lang w:eastAsia="pt-BR"/>
+                <w14:ligatures w14:val="none"/>
+              </w:rPr>
+            </w:pPr>
+            <w:r>
+              <w:rPr>
+                <w:rFonts w:ascii="Aptos Narrow" w:eastAsia="Times New Roman" w:hAnsi="Aptos Narrow" w:cs="Times New Roman"/>
+                <w:color w:val="000000"/>
+                <w:kern w:val="0"/>
+                <w:sz w:val="22"/>
+                <w:szCs w:val="22"/>
+                <w:lang w:eastAsia="pt-BR"/>
+                <w14:ligatures w14:val="none"/>
+              </w:rPr>
+              <w:t>Redistribuição de tarefas</w:t>
+            </w:r>
+          </w:p>
+        </w:tc>
+      </w:tr>
+      <w:tr>
+        <w:trPr>
+          <w:trHeight w:val="1680"/>
+        </w:trPr>
+        <w:tc>
+          <w:tcPr>
+            <w:tcW w:w="580" w:type="dxa"/>
+            <w:tcBorders>
+              <w:top w:val="nil"/>
+              <w:left w:val="single" w:sz="8" w:space="0" w:color="auto"/>
+              <w:bottom w:val="single" w:sz="4" w:space="0" w:color="auto"/>
+              <w:right w:val="single" w:sz="4" w:space="0" w:color="auto"/>
+            </w:tcBorders>
+            <w:shd w:val="clear" w:color="auto" w:fill="auto"/>
+            <w:noWrap/>
+            <w:vAlign w:val="center"/>
+            <w:hideMark/>
+          </w:tcPr>
+          <w:p>
+            <w:pPr>
+              <w:spacing w:after="0" w:line="240" w:lineRule="auto"/>
+              <w:ind w:firstLine="0"/>
+              <w:jc w:val="center"/>
+              <w:rPr>
+                <w:rFonts w:ascii="Aptos Narrow" w:eastAsia="Times New Roman" w:hAnsi="Aptos Narrow" w:cs="Times New Roman"/>
+                <w:color w:val="000000"/>
+                <w:kern w:val="0"/>
+                <w:sz w:val="22"/>
+                <w:szCs w:val="22"/>
+                <w:lang w:eastAsia="pt-BR"/>
+                <w14:ligatures w14:val="none"/>
+              </w:rPr>
+            </w:pPr>
+            <w:r>
+              <w:rPr>
+                <w:rFonts w:ascii="Aptos Narrow" w:eastAsia="Times New Roman" w:hAnsi="Aptos Narrow" w:cs="Times New Roman"/>
+                <w:color w:val="000000"/>
+                <w:kern w:val="0"/>
+                <w:sz w:val="22"/>
+                <w:szCs w:val="22"/>
+                <w:lang w:eastAsia="pt-BR"/>
+                <w14:ligatures w14:val="none"/>
+              </w:rPr>
+              <w:t>2</w:t>
+            </w:r>
+          </w:p>
+        </w:tc>
+        <w:tc>
+          <w:tcPr>
+            <w:tcW w:w="2320" w:type="dxa"/>
+            <w:tcBorders>
+              <w:top w:val="single" w:sz="4" w:space="0" w:color="auto"/>
+              <w:left w:val="nil"/>
+              <w:bottom w:val="single" w:sz="4" w:space="0" w:color="auto"/>
+              <w:right w:val="single" w:sz="4" w:space="0" w:color="auto"/>
+            </w:tcBorders>
+            <w:shd w:val="clear" w:color="auto" w:fill="auto"/>
+            <w:vAlign w:val="center"/>
+            <w:hideMark/>
+          </w:tcPr>
+          <w:p>
+            <w:pPr>
+              <w:spacing w:after="0" w:line="240" w:lineRule="auto"/>
+              <w:ind w:firstLine="0"/>
+              <w:jc w:val="left"/>
+              <w:rPr>
+                <w:rFonts w:ascii="Aptos Narrow" w:eastAsia="Times New Roman" w:hAnsi="Aptos Narrow" w:cs="Times New Roman"/>
+                <w:color w:val="000000"/>
+                <w:kern w:val="0"/>
+                <w:sz w:val="22"/>
+                <w:szCs w:val="22"/>
+                <w:lang w:eastAsia="pt-BR"/>
+                <w14:ligatures w14:val="none"/>
+              </w:rPr>
+            </w:pPr>
+            <w:r>
+              <w:rPr>
+                <w:rFonts w:ascii="Aptos Narrow" w:eastAsia="Times New Roman" w:hAnsi="Aptos Narrow" w:cs="Times New Roman"/>
+                <w:color w:val="000000"/>
+                <w:kern w:val="0"/>
+                <w:sz w:val="22"/>
+                <w:szCs w:val="22"/>
+                <w:lang w:eastAsia="pt-BR"/>
+                <w14:ligatures w14:val="none"/>
+              </w:rPr>
+              <w:t xml:space="preserve">Falta de comunicação entre cliente e equipe </w:t>
+            </w:r>
+            <w:proofErr w:type="spellStart"/>
+            <w:r>
+              <w:rPr>
+                <w:rFonts w:ascii="Aptos Narrow" w:eastAsia="Times New Roman" w:hAnsi="Aptos Narrow" w:cs="Times New Roman"/>
+                <w:color w:val="000000"/>
+                <w:kern w:val="0"/>
+                <w:sz w:val="22"/>
+                <w:szCs w:val="22"/>
+                <w:lang w:eastAsia="pt-BR"/>
+                <w14:ligatures w14:val="none"/>
+              </w:rPr>
+              <w:t>responsavel</w:t>
+            </w:r>
+            <w:proofErr w:type="spellEnd"/>
+            <w:r>
+              <w:rPr>
+                <w:rFonts w:ascii="Aptos Narrow" w:eastAsia="Times New Roman" w:hAnsi="Aptos Narrow" w:cs="Times New Roman"/>
+                <w:color w:val="000000"/>
+                <w:kern w:val="0"/>
+                <w:sz w:val="22"/>
+                <w:szCs w:val="22"/>
+                <w:lang w:eastAsia="pt-BR"/>
+                <w14:ligatures w14:val="none"/>
+              </w:rPr>
+              <w:t xml:space="preserve"> do projeto</w:t>
+            </w:r>
+          </w:p>
+        </w:tc>
+        <w:tc>
+          <w:tcPr>
+            <w:tcW w:w="1280" w:type="dxa"/>
+            <w:tcBorders>
+              <w:top w:val="single" w:sz="4" w:space="0" w:color="auto"/>
+              <w:left w:val="nil"/>
+              <w:bottom w:val="single" w:sz="4" w:space="0" w:color="auto"/>
+              <w:right w:val="single" w:sz="4" w:space="0" w:color="auto"/>
+            </w:tcBorders>
+            <w:shd w:val="clear" w:color="auto" w:fill="auto"/>
+            <w:noWrap/>
+            <w:vAlign w:val="center"/>
+            <w:hideMark/>
+          </w:tcPr>
+          <w:p>
+            <w:pPr>
+              <w:spacing w:after="0" w:line="240" w:lineRule="auto"/>
+              <w:ind w:firstLine="0"/>
+              <w:jc w:val="center"/>
+              <w:rPr>
+                <w:rFonts w:ascii="Aptos Narrow" w:eastAsia="Times New Roman" w:hAnsi="Aptos Narrow" w:cs="Times New Roman"/>
+                <w:color w:val="000000"/>
+                <w:kern w:val="0"/>
+                <w:sz w:val="22"/>
+                <w:szCs w:val="22"/>
+                <w:lang w:eastAsia="pt-BR"/>
+                <w14:ligatures w14:val="none"/>
+              </w:rPr>
+            </w:pPr>
+            <w:r>
+              <w:rPr>
+                <w:rFonts w:ascii="Aptos Narrow" w:eastAsia="Times New Roman" w:hAnsi="Aptos Narrow" w:cs="Times New Roman"/>
+                <w:color w:val="000000"/>
+                <w:kern w:val="0"/>
+                <w:sz w:val="22"/>
+                <w:szCs w:val="22"/>
+                <w:lang w:eastAsia="pt-BR"/>
+                <w14:ligatures w14:val="none"/>
+              </w:rPr>
+              <w:t>3</w:t>
+            </w:r>
+          </w:p>
+        </w:tc>
+        <w:tc>
+          <w:tcPr>
+            <w:tcW w:w="800" w:type="dxa"/>
+            <w:tcBorders>
+              <w:top w:val="single" w:sz="4" w:space="0" w:color="auto"/>
+              <w:left w:val="nil"/>
+              <w:bottom w:val="single" w:sz="4" w:space="0" w:color="auto"/>
+              <w:right w:val="single" w:sz="4" w:space="0" w:color="auto"/>
+            </w:tcBorders>
+            <w:shd w:val="clear" w:color="auto" w:fill="auto"/>
+            <w:noWrap/>
+            <w:vAlign w:val="center"/>
+            <w:hideMark/>
+          </w:tcPr>
+          <w:p>
+            <w:pPr>
+              <w:spacing w:after="0" w:line="240" w:lineRule="auto"/>
+              <w:ind w:firstLine="0"/>
+              <w:jc w:val="center"/>
+              <w:rPr>
+                <w:rFonts w:ascii="Aptos Narrow" w:eastAsia="Times New Roman" w:hAnsi="Aptos Narrow" w:cs="Times New Roman"/>
+                <w:color w:val="000000"/>
+                <w:kern w:val="0"/>
+                <w:sz w:val="22"/>
+                <w:szCs w:val="22"/>
+                <w:lang w:eastAsia="pt-BR"/>
+                <w14:ligatures w14:val="none"/>
+              </w:rPr>
+            </w:pPr>
+            <w:r>
+              <w:rPr>
+                <w:rFonts w:ascii="Aptos Narrow" w:eastAsia="Times New Roman" w:hAnsi="Aptos Narrow" w:cs="Times New Roman"/>
+                <w:color w:val="000000"/>
+                <w:kern w:val="0"/>
+                <w:sz w:val="22"/>
+                <w:szCs w:val="22"/>
+                <w:lang w:eastAsia="pt-BR"/>
+                <w14:ligatures w14:val="none"/>
+              </w:rPr>
+              <w:t>3</w:t>
+            </w:r>
+          </w:p>
+        </w:tc>
+        <w:tc>
+          <w:tcPr>
+            <w:tcW w:w="800" w:type="dxa"/>
+            <w:tcBorders>
+              <w:top w:val="single" w:sz="4" w:space="0" w:color="auto"/>
+              <w:left w:val="nil"/>
+              <w:bottom w:val="single" w:sz="4" w:space="0" w:color="auto"/>
+              <w:right w:val="single" w:sz="4" w:space="0" w:color="auto"/>
+            </w:tcBorders>
+            <w:shd w:val="clear" w:color="auto" w:fill="auto"/>
+            <w:noWrap/>
+            <w:vAlign w:val="center"/>
+            <w:hideMark/>
+          </w:tcPr>
+          <w:p>
+            <w:pPr>
+              <w:spacing w:after="0" w:line="240" w:lineRule="auto"/>
+              <w:ind w:firstLine="0"/>
+              <w:jc w:val="center"/>
+              <w:rPr>
+                <w:rFonts w:ascii="Aptos Narrow" w:eastAsia="Times New Roman" w:hAnsi="Aptos Narrow" w:cs="Times New Roman"/>
+                <w:color w:val="000000"/>
+                <w:kern w:val="0"/>
+                <w:sz w:val="22"/>
+                <w:szCs w:val="22"/>
+                <w:lang w:eastAsia="pt-BR"/>
+                <w14:ligatures w14:val="none"/>
+              </w:rPr>
+            </w:pPr>
+            <w:r>
+              <w:rPr>
+                <w:rFonts w:ascii="Aptos Narrow" w:eastAsia="Times New Roman" w:hAnsi="Aptos Narrow" w:cs="Times New Roman"/>
+                <w:color w:val="000000"/>
+                <w:kern w:val="0"/>
+                <w:sz w:val="22"/>
+                <w:szCs w:val="22"/>
+                <w:lang w:eastAsia="pt-BR"/>
+                <w14:ligatures w14:val="none"/>
+              </w:rPr>
+              <w:t>9</w:t>
+            </w:r>
+          </w:p>
+        </w:tc>
+        <w:tc>
+          <w:tcPr>
+            <w:tcW w:w="780" w:type="dxa"/>
+            <w:tcBorders>
+              <w:top w:val="nil"/>
+              <w:left w:val="nil"/>
+              <w:bottom w:val="single" w:sz="4" w:space="0" w:color="auto"/>
+              <w:right w:val="single" w:sz="4" w:space="0" w:color="auto"/>
+            </w:tcBorders>
+            <w:shd w:val="clear" w:color="auto" w:fill="auto"/>
+            <w:noWrap/>
+            <w:vAlign w:val="center"/>
+            <w:hideMark/>
+          </w:tcPr>
+          <w:p>
+            <w:pPr>
+              <w:spacing w:after="0" w:line="240" w:lineRule="auto"/>
+              <w:ind w:firstLine="0"/>
+              <w:jc w:val="center"/>
+              <w:rPr>
+                <w:rFonts w:ascii="Aptos Narrow" w:eastAsia="Times New Roman" w:hAnsi="Aptos Narrow" w:cs="Times New Roman"/>
+                <w:color w:val="000000"/>
+                <w:kern w:val="0"/>
+                <w:sz w:val="22"/>
+                <w:szCs w:val="22"/>
+                <w:lang w:eastAsia="pt-BR"/>
+                <w14:ligatures w14:val="none"/>
+              </w:rPr>
+            </w:pPr>
+            <w:r>
+              <w:rPr>
+                <w:rFonts w:ascii="Aptos Narrow" w:eastAsia="Times New Roman" w:hAnsi="Aptos Narrow" w:cs="Times New Roman"/>
+                <w:color w:val="000000"/>
+                <w:kern w:val="0"/>
+                <w:sz w:val="22"/>
+                <w:szCs w:val="22"/>
+                <w:lang w:eastAsia="pt-BR"/>
+                <w14:ligatures w14:val="none"/>
+              </w:rPr>
+              <w:t>Evitar</w:t>
+            </w:r>
+          </w:p>
+        </w:tc>
+        <w:tc>
+          <w:tcPr>
+            <w:tcW w:w="2500" w:type="dxa"/>
+            <w:tcBorders>
+              <w:top w:val="single" w:sz="4" w:space="0" w:color="auto"/>
+              <w:left w:val="nil"/>
+              <w:bottom w:val="single" w:sz="4" w:space="0" w:color="auto"/>
+              <w:right w:val="single" w:sz="8" w:space="0" w:color="000000"/>
+            </w:tcBorders>
+            <w:shd w:val="clear" w:color="auto" w:fill="auto"/>
+            <w:vAlign w:val="center"/>
+            <w:hideMark/>
+          </w:tcPr>
+          <w:p>
+            <w:pPr>
+              <w:spacing w:after="0" w:line="240" w:lineRule="auto"/>
+              <w:ind w:firstLine="0"/>
+              <w:rPr>
+                <w:rFonts w:ascii="Aptos Narrow" w:eastAsia="Times New Roman" w:hAnsi="Aptos Narrow" w:cs="Times New Roman"/>
+                <w:color w:val="000000"/>
+                <w:kern w:val="0"/>
+                <w:sz w:val="22"/>
+                <w:szCs w:val="22"/>
+                <w:lang w:eastAsia="pt-BR"/>
+                <w14:ligatures w14:val="none"/>
+              </w:rPr>
+            </w:pPr>
+            <w:r>
+              <w:rPr>
+                <w:rFonts w:ascii="Aptos Narrow" w:eastAsia="Times New Roman" w:hAnsi="Aptos Narrow" w:cs="Times New Roman"/>
+                <w:color w:val="000000"/>
+                <w:kern w:val="0"/>
+                <w:sz w:val="22"/>
+                <w:szCs w:val="22"/>
+                <w:lang w:eastAsia="pt-BR"/>
+                <w14:ligatures w14:val="none"/>
+              </w:rPr>
+              <w:t xml:space="preserve">Comunicar ao cliente que qualquer alteração que afete o funcionamento do sistema deve ser </w:t>
+            </w:r>
+            <w:proofErr w:type="gramStart"/>
+            <w:r>
+              <w:rPr>
+                <w:rFonts w:ascii="Aptos Narrow" w:eastAsia="Times New Roman" w:hAnsi="Aptos Narrow" w:cs="Times New Roman"/>
+                <w:color w:val="000000"/>
+                <w:kern w:val="0"/>
+                <w:sz w:val="22"/>
+                <w:szCs w:val="22"/>
+                <w:lang w:eastAsia="pt-BR"/>
+                <w14:ligatures w14:val="none"/>
+              </w:rPr>
+              <w:t>comunicado</w:t>
+            </w:r>
+            <w:proofErr w:type="gramEnd"/>
+            <w:r>
+              <w:rPr>
+                <w:rFonts w:ascii="Aptos Narrow" w:eastAsia="Times New Roman" w:hAnsi="Aptos Narrow" w:cs="Times New Roman"/>
+                <w:color w:val="000000"/>
+                <w:kern w:val="0"/>
+                <w:sz w:val="22"/>
+                <w:szCs w:val="22"/>
+                <w:lang w:eastAsia="pt-BR"/>
+                <w14:ligatures w14:val="none"/>
+              </w:rPr>
+              <w:t xml:space="preserve"> previamente</w:t>
+            </w:r>
+          </w:p>
+        </w:tc>
+      </w:tr>
+      <w:tr>
+        <w:trPr>
+          <w:trHeight w:val="1020"/>
+        </w:trPr>
+        <w:tc>
+          <w:tcPr>
+            <w:tcW w:w="580" w:type="dxa"/>
+            <w:tcBorders>
+              <w:top w:val="nil"/>
+              <w:left w:val="single" w:sz="8" w:space="0" w:color="auto"/>
+              <w:bottom w:val="single" w:sz="4" w:space="0" w:color="auto"/>
+              <w:right w:val="single" w:sz="4" w:space="0" w:color="auto"/>
+            </w:tcBorders>
+            <w:shd w:val="clear" w:color="auto" w:fill="auto"/>
+            <w:noWrap/>
+            <w:vAlign w:val="center"/>
+            <w:hideMark/>
+          </w:tcPr>
+          <w:p>
+            <w:pPr>
+              <w:spacing w:after="0" w:line="240" w:lineRule="auto"/>
+              <w:ind w:firstLine="0"/>
+              <w:jc w:val="center"/>
+              <w:rPr>
+                <w:rFonts w:ascii="Aptos Narrow" w:eastAsia="Times New Roman" w:hAnsi="Aptos Narrow" w:cs="Times New Roman"/>
+                <w:color w:val="000000"/>
+                <w:kern w:val="0"/>
+                <w:sz w:val="22"/>
+                <w:szCs w:val="22"/>
+                <w:lang w:eastAsia="pt-BR"/>
+                <w14:ligatures w14:val="none"/>
+              </w:rPr>
+            </w:pPr>
+            <w:r>
+              <w:rPr>
+                <w:rFonts w:ascii="Aptos Narrow" w:eastAsia="Times New Roman" w:hAnsi="Aptos Narrow" w:cs="Times New Roman"/>
+                <w:color w:val="000000"/>
+                <w:kern w:val="0"/>
+                <w:sz w:val="22"/>
+                <w:szCs w:val="22"/>
+                <w:lang w:eastAsia="pt-BR"/>
+                <w14:ligatures w14:val="none"/>
+              </w:rPr>
+              <w:t>3</w:t>
+            </w:r>
+          </w:p>
+        </w:tc>
+        <w:tc>
+          <w:tcPr>
+            <w:tcW w:w="2320" w:type="dxa"/>
+            <w:tcBorders>
+              <w:top w:val="single" w:sz="4" w:space="0" w:color="auto"/>
+              <w:left w:val="nil"/>
+              <w:bottom w:val="single" w:sz="4" w:space="0" w:color="auto"/>
+              <w:right w:val="single" w:sz="4" w:space="0" w:color="auto"/>
+            </w:tcBorders>
+            <w:shd w:val="clear" w:color="auto" w:fill="auto"/>
+            <w:vAlign w:val="center"/>
+            <w:hideMark/>
+          </w:tcPr>
+          <w:p>
+            <w:pPr>
+              <w:spacing w:after="0" w:line="240" w:lineRule="auto"/>
+              <w:ind w:firstLine="0"/>
+              <w:jc w:val="left"/>
+              <w:rPr>
+                <w:rFonts w:ascii="Aptos Narrow" w:eastAsia="Times New Roman" w:hAnsi="Aptos Narrow" w:cs="Times New Roman"/>
+                <w:color w:val="000000"/>
+                <w:kern w:val="0"/>
+                <w:sz w:val="22"/>
+                <w:szCs w:val="22"/>
+                <w:lang w:eastAsia="pt-BR"/>
+                <w14:ligatures w14:val="none"/>
+              </w:rPr>
+            </w:pPr>
+            <w:r>
+              <w:rPr>
+                <w:rFonts w:ascii="Aptos Narrow" w:eastAsia="Times New Roman" w:hAnsi="Aptos Narrow" w:cs="Times New Roman"/>
+                <w:color w:val="000000"/>
+                <w:kern w:val="0"/>
+                <w:sz w:val="22"/>
+                <w:szCs w:val="22"/>
+                <w:lang w:eastAsia="pt-BR"/>
+                <w14:ligatures w14:val="none"/>
+              </w:rPr>
+              <w:t>Descontinuação de ferramenta de trabalho</w:t>
+            </w:r>
+          </w:p>
+        </w:tc>
+        <w:tc>
+          <w:tcPr>
+            <w:tcW w:w="1280" w:type="dxa"/>
+            <w:tcBorders>
+              <w:top w:val="single" w:sz="4" w:space="0" w:color="auto"/>
+              <w:left w:val="nil"/>
+              <w:bottom w:val="single" w:sz="4" w:space="0" w:color="auto"/>
+              <w:right w:val="single" w:sz="4" w:space="0" w:color="auto"/>
+            </w:tcBorders>
+            <w:shd w:val="clear" w:color="auto" w:fill="auto"/>
+            <w:noWrap/>
+            <w:vAlign w:val="center"/>
+            <w:hideMark/>
+          </w:tcPr>
+          <w:p>
+            <w:pPr>
+              <w:spacing w:after="0" w:line="240" w:lineRule="auto"/>
+              <w:ind w:firstLine="0"/>
+              <w:jc w:val="center"/>
+              <w:rPr>
+                <w:rFonts w:ascii="Aptos Narrow" w:eastAsia="Times New Roman" w:hAnsi="Aptos Narrow" w:cs="Times New Roman"/>
+                <w:color w:val="000000"/>
+                <w:kern w:val="0"/>
+                <w:sz w:val="22"/>
+                <w:szCs w:val="22"/>
+                <w:lang w:eastAsia="pt-BR"/>
+                <w14:ligatures w14:val="none"/>
+              </w:rPr>
+            </w:pPr>
+            <w:r>
+              <w:rPr>
+                <w:rFonts w:ascii="Aptos Narrow" w:eastAsia="Times New Roman" w:hAnsi="Aptos Narrow" w:cs="Times New Roman"/>
+                <w:color w:val="000000"/>
+                <w:kern w:val="0"/>
+                <w:sz w:val="22"/>
+                <w:szCs w:val="22"/>
+                <w:lang w:eastAsia="pt-BR"/>
+                <w14:ligatures w14:val="none"/>
+              </w:rPr>
+              <w:t>1</w:t>
+            </w:r>
+          </w:p>
+        </w:tc>
+        <w:tc>
+          <w:tcPr>
+            <w:tcW w:w="800" w:type="dxa"/>
+            <w:tcBorders>
+              <w:top w:val="single" w:sz="4" w:space="0" w:color="auto"/>
+              <w:left w:val="nil"/>
+              <w:bottom w:val="single" w:sz="4" w:space="0" w:color="auto"/>
+              <w:right w:val="single" w:sz="4" w:space="0" w:color="auto"/>
+            </w:tcBorders>
+            <w:shd w:val="clear" w:color="auto" w:fill="auto"/>
+            <w:noWrap/>
+            <w:vAlign w:val="center"/>
+            <w:hideMark/>
+          </w:tcPr>
+          <w:p>
+            <w:pPr>
+              <w:spacing w:after="0" w:line="240" w:lineRule="auto"/>
+              <w:ind w:firstLine="0"/>
+              <w:jc w:val="center"/>
+              <w:rPr>
+                <w:rFonts w:ascii="Aptos Narrow" w:eastAsia="Times New Roman" w:hAnsi="Aptos Narrow" w:cs="Times New Roman"/>
+                <w:color w:val="000000"/>
+                <w:kern w:val="0"/>
+                <w:sz w:val="22"/>
+                <w:szCs w:val="22"/>
+                <w:lang w:eastAsia="pt-BR"/>
+                <w14:ligatures w14:val="none"/>
+              </w:rPr>
+            </w:pPr>
+            <w:r>
+              <w:rPr>
+                <w:rFonts w:ascii="Aptos Narrow" w:eastAsia="Times New Roman" w:hAnsi="Aptos Narrow" w:cs="Times New Roman"/>
+                <w:color w:val="000000"/>
+                <w:kern w:val="0"/>
+                <w:sz w:val="22"/>
+                <w:szCs w:val="22"/>
+                <w:lang w:eastAsia="pt-BR"/>
+                <w14:ligatures w14:val="none"/>
+              </w:rPr>
+              <w:t>3</w:t>
+            </w:r>
+          </w:p>
+        </w:tc>
+        <w:tc>
+          <w:tcPr>
+            <w:tcW w:w="800" w:type="dxa"/>
+            <w:tcBorders>
+              <w:top w:val="single" w:sz="4" w:space="0" w:color="auto"/>
+              <w:left w:val="nil"/>
+              <w:bottom w:val="single" w:sz="4" w:space="0" w:color="auto"/>
+              <w:right w:val="single" w:sz="4" w:space="0" w:color="auto"/>
+            </w:tcBorders>
+            <w:shd w:val="clear" w:color="auto" w:fill="auto"/>
+            <w:noWrap/>
+            <w:vAlign w:val="center"/>
+            <w:hideMark/>
+          </w:tcPr>
+          <w:p>
+            <w:pPr>
+              <w:spacing w:after="0" w:line="240" w:lineRule="auto"/>
+              <w:ind w:firstLine="0"/>
+              <w:jc w:val="center"/>
+              <w:rPr>
+                <w:rFonts w:ascii="Aptos Narrow" w:eastAsia="Times New Roman" w:hAnsi="Aptos Narrow" w:cs="Times New Roman"/>
+                <w:color w:val="000000"/>
+                <w:kern w:val="0"/>
+                <w:sz w:val="22"/>
+                <w:szCs w:val="22"/>
+                <w:lang w:eastAsia="pt-BR"/>
+                <w14:ligatures w14:val="none"/>
+              </w:rPr>
+            </w:pPr>
+            <w:r>
+              <w:rPr>
+                <w:rFonts w:ascii="Aptos Narrow" w:eastAsia="Times New Roman" w:hAnsi="Aptos Narrow" w:cs="Times New Roman"/>
+                <w:color w:val="000000"/>
+                <w:kern w:val="0"/>
+                <w:sz w:val="22"/>
+                <w:szCs w:val="22"/>
+                <w:lang w:eastAsia="pt-BR"/>
+                <w14:ligatures w14:val="none"/>
+              </w:rPr>
+              <w:t>3</w:t>
+            </w:r>
+          </w:p>
+        </w:tc>
+        <w:tc>
+          <w:tcPr>
+            <w:tcW w:w="780" w:type="dxa"/>
+            <w:tcBorders>
+              <w:top w:val="nil"/>
+              <w:left w:val="nil"/>
+              <w:bottom w:val="single" w:sz="4" w:space="0" w:color="auto"/>
+              <w:right w:val="single" w:sz="4" w:space="0" w:color="auto"/>
+            </w:tcBorders>
+            <w:shd w:val="clear" w:color="auto" w:fill="auto"/>
+            <w:noWrap/>
+            <w:vAlign w:val="center"/>
+            <w:hideMark/>
+          </w:tcPr>
+          <w:p>
+            <w:pPr>
+              <w:spacing w:after="0" w:line="240" w:lineRule="auto"/>
+              <w:ind w:firstLine="0"/>
+              <w:jc w:val="center"/>
+              <w:rPr>
+                <w:rFonts w:ascii="Aptos Narrow" w:eastAsia="Times New Roman" w:hAnsi="Aptos Narrow" w:cs="Times New Roman"/>
+                <w:color w:val="000000"/>
+                <w:kern w:val="0"/>
+                <w:sz w:val="22"/>
+                <w:szCs w:val="22"/>
+                <w:lang w:eastAsia="pt-BR"/>
+                <w14:ligatures w14:val="none"/>
+              </w:rPr>
+            </w:pPr>
+            <w:r>
+              <w:rPr>
+                <w:rFonts w:ascii="Aptos Narrow" w:eastAsia="Times New Roman" w:hAnsi="Aptos Narrow" w:cs="Times New Roman"/>
+                <w:color w:val="000000"/>
+                <w:kern w:val="0"/>
+                <w:sz w:val="22"/>
+                <w:szCs w:val="22"/>
+                <w:lang w:eastAsia="pt-BR"/>
+                <w14:ligatures w14:val="none"/>
+              </w:rPr>
+              <w:t>Mitigar</w:t>
+            </w:r>
+          </w:p>
+        </w:tc>
+        <w:tc>
+          <w:tcPr>
+            <w:tcW w:w="2500" w:type="dxa"/>
+            <w:tcBorders>
+              <w:top w:val="single" w:sz="4" w:space="0" w:color="auto"/>
+              <w:left w:val="nil"/>
+              <w:bottom w:val="single" w:sz="4" w:space="0" w:color="auto"/>
+              <w:right w:val="single" w:sz="8" w:space="0" w:color="000000"/>
+            </w:tcBorders>
+            <w:shd w:val="clear" w:color="auto" w:fill="auto"/>
+            <w:vAlign w:val="center"/>
+            <w:hideMark/>
+          </w:tcPr>
+          <w:p>
+            <w:pPr>
+              <w:spacing w:after="0" w:line="240" w:lineRule="auto"/>
+              <w:ind w:firstLine="0"/>
+              <w:rPr>
+                <w:rFonts w:ascii="Aptos Narrow" w:eastAsia="Times New Roman" w:hAnsi="Aptos Narrow" w:cs="Times New Roman"/>
+                <w:color w:val="000000"/>
+                <w:kern w:val="0"/>
+                <w:sz w:val="22"/>
+                <w:szCs w:val="22"/>
+                <w:lang w:eastAsia="pt-BR"/>
+                <w14:ligatures w14:val="none"/>
+              </w:rPr>
+            </w:pPr>
+            <w:r>
+              <w:rPr>
+                <w:rFonts w:ascii="Aptos Narrow" w:eastAsia="Times New Roman" w:hAnsi="Aptos Narrow" w:cs="Times New Roman"/>
+                <w:color w:val="000000"/>
+                <w:kern w:val="0"/>
+                <w:sz w:val="22"/>
+                <w:szCs w:val="22"/>
+                <w:lang w:eastAsia="pt-BR"/>
+                <w14:ligatures w14:val="none"/>
+              </w:rPr>
+              <w:t xml:space="preserve">Transição para uma nova </w:t>
+            </w:r>
+            <w:proofErr w:type="spellStart"/>
+            <w:r>
+              <w:rPr>
+                <w:rFonts w:ascii="Aptos Narrow" w:eastAsia="Times New Roman" w:hAnsi="Aptos Narrow" w:cs="Times New Roman"/>
+                <w:color w:val="000000"/>
+                <w:kern w:val="0"/>
+                <w:sz w:val="22"/>
+                <w:szCs w:val="22"/>
+                <w:lang w:eastAsia="pt-BR"/>
+                <w14:ligatures w14:val="none"/>
+              </w:rPr>
+              <w:t>ferramente</w:t>
+            </w:r>
+            <w:proofErr w:type="spellEnd"/>
+            <w:r>
+              <w:rPr>
+                <w:rFonts w:ascii="Aptos Narrow" w:eastAsia="Times New Roman" w:hAnsi="Aptos Narrow" w:cs="Times New Roman"/>
+                <w:color w:val="000000"/>
+                <w:kern w:val="0"/>
+                <w:sz w:val="22"/>
+                <w:szCs w:val="22"/>
+                <w:lang w:eastAsia="pt-BR"/>
+                <w14:ligatures w14:val="none"/>
+              </w:rPr>
+              <w:t xml:space="preserve"> que seja igualmente eficiente </w:t>
+            </w:r>
+          </w:p>
+        </w:tc>
+      </w:tr>
+      <w:tr>
+        <w:trPr>
+          <w:trHeight w:val="1296"/>
+        </w:trPr>
+        <w:tc>
+          <w:tcPr>
+            <w:tcW w:w="580" w:type="dxa"/>
+            <w:tcBorders>
+              <w:top w:val="nil"/>
+              <w:left w:val="single" w:sz="8" w:space="0" w:color="auto"/>
+              <w:bottom w:val="single" w:sz="4" w:space="0" w:color="auto"/>
+              <w:right w:val="single" w:sz="4" w:space="0" w:color="auto"/>
+            </w:tcBorders>
+            <w:shd w:val="clear" w:color="auto" w:fill="auto"/>
+            <w:noWrap/>
+            <w:vAlign w:val="center"/>
+            <w:hideMark/>
+          </w:tcPr>
+          <w:p>
+            <w:pPr>
+              <w:spacing w:after="0" w:line="240" w:lineRule="auto"/>
+              <w:ind w:firstLine="0"/>
+              <w:jc w:val="center"/>
+              <w:rPr>
+                <w:rFonts w:ascii="Aptos Narrow" w:eastAsia="Times New Roman" w:hAnsi="Aptos Narrow" w:cs="Times New Roman"/>
+                <w:color w:val="000000"/>
+                <w:kern w:val="0"/>
+                <w:sz w:val="22"/>
+                <w:szCs w:val="22"/>
+                <w:lang w:eastAsia="pt-BR"/>
+                <w14:ligatures w14:val="none"/>
+              </w:rPr>
+            </w:pPr>
+            <w:r>
+              <w:rPr>
+                <w:rFonts w:ascii="Aptos Narrow" w:eastAsia="Times New Roman" w:hAnsi="Aptos Narrow" w:cs="Times New Roman"/>
+                <w:color w:val="000000"/>
+                <w:kern w:val="0"/>
+                <w:sz w:val="22"/>
+                <w:szCs w:val="22"/>
+                <w:lang w:eastAsia="pt-BR"/>
+                <w14:ligatures w14:val="none"/>
+              </w:rPr>
+              <w:t>4</w:t>
+            </w:r>
+          </w:p>
+        </w:tc>
+        <w:tc>
+          <w:tcPr>
+            <w:tcW w:w="2320" w:type="dxa"/>
+            <w:tcBorders>
+              <w:top w:val="single" w:sz="4" w:space="0" w:color="auto"/>
+              <w:left w:val="nil"/>
+              <w:bottom w:val="single" w:sz="4" w:space="0" w:color="auto"/>
+              <w:right w:val="single" w:sz="4" w:space="0" w:color="auto"/>
+            </w:tcBorders>
+            <w:shd w:val="clear" w:color="auto" w:fill="auto"/>
+            <w:vAlign w:val="center"/>
+            <w:hideMark/>
+          </w:tcPr>
+          <w:p>
+            <w:pPr>
+              <w:spacing w:after="0" w:line="240" w:lineRule="auto"/>
+              <w:ind w:firstLine="0"/>
+              <w:jc w:val="left"/>
+              <w:rPr>
+                <w:rFonts w:ascii="Aptos Narrow" w:eastAsia="Times New Roman" w:hAnsi="Aptos Narrow" w:cs="Times New Roman"/>
+                <w:color w:val="000000"/>
+                <w:kern w:val="0"/>
+                <w:sz w:val="22"/>
+                <w:szCs w:val="22"/>
+                <w:lang w:eastAsia="pt-BR"/>
+                <w14:ligatures w14:val="none"/>
+              </w:rPr>
+            </w:pPr>
+            <w:r>
+              <w:rPr>
+                <w:rFonts w:ascii="Aptos Narrow" w:eastAsia="Times New Roman" w:hAnsi="Aptos Narrow" w:cs="Times New Roman"/>
+                <w:color w:val="000000"/>
+                <w:kern w:val="0"/>
+                <w:sz w:val="22"/>
+                <w:szCs w:val="22"/>
+                <w:lang w:eastAsia="pt-BR"/>
+                <w14:ligatures w14:val="none"/>
+              </w:rPr>
+              <w:t>Falta de comprometimento de integrante da equipe</w:t>
+            </w:r>
+          </w:p>
+        </w:tc>
+        <w:tc>
+          <w:tcPr>
+            <w:tcW w:w="1280" w:type="dxa"/>
+            <w:tcBorders>
+              <w:top w:val="single" w:sz="4" w:space="0" w:color="auto"/>
+              <w:left w:val="nil"/>
+              <w:bottom w:val="single" w:sz="4" w:space="0" w:color="auto"/>
+              <w:right w:val="single" w:sz="4" w:space="0" w:color="auto"/>
+            </w:tcBorders>
+            <w:shd w:val="clear" w:color="auto" w:fill="auto"/>
+            <w:noWrap/>
+            <w:vAlign w:val="center"/>
+            <w:hideMark/>
+          </w:tcPr>
+          <w:p>
+            <w:pPr>
+              <w:spacing w:after="0" w:line="240" w:lineRule="auto"/>
+              <w:ind w:firstLine="0"/>
+              <w:jc w:val="center"/>
+              <w:rPr>
+                <w:rFonts w:ascii="Aptos Narrow" w:eastAsia="Times New Roman" w:hAnsi="Aptos Narrow" w:cs="Times New Roman"/>
+                <w:color w:val="000000"/>
+                <w:kern w:val="0"/>
+                <w:sz w:val="22"/>
+                <w:szCs w:val="22"/>
+                <w:lang w:eastAsia="pt-BR"/>
+                <w14:ligatures w14:val="none"/>
+              </w:rPr>
+            </w:pPr>
+            <w:r>
+              <w:rPr>
+                <w:rFonts w:ascii="Aptos Narrow" w:eastAsia="Times New Roman" w:hAnsi="Aptos Narrow" w:cs="Times New Roman"/>
+                <w:color w:val="000000"/>
+                <w:kern w:val="0"/>
+                <w:sz w:val="22"/>
+                <w:szCs w:val="22"/>
+                <w:lang w:eastAsia="pt-BR"/>
+                <w14:ligatures w14:val="none"/>
+              </w:rPr>
+              <w:t>1</w:t>
+            </w:r>
+          </w:p>
+        </w:tc>
+        <w:tc>
+          <w:tcPr>
+            <w:tcW w:w="800" w:type="dxa"/>
+            <w:tcBorders>
+              <w:top w:val="single" w:sz="4" w:space="0" w:color="auto"/>
+              <w:left w:val="nil"/>
+              <w:bottom w:val="single" w:sz="4" w:space="0" w:color="auto"/>
+              <w:right w:val="single" w:sz="4" w:space="0" w:color="auto"/>
+            </w:tcBorders>
+            <w:shd w:val="clear" w:color="auto" w:fill="auto"/>
+            <w:noWrap/>
+            <w:vAlign w:val="center"/>
+            <w:hideMark/>
+          </w:tcPr>
+          <w:p>
+            <w:pPr>
+              <w:spacing w:after="0" w:line="240" w:lineRule="auto"/>
+              <w:ind w:firstLine="0"/>
+              <w:jc w:val="center"/>
+              <w:rPr>
+                <w:rFonts w:ascii="Aptos Narrow" w:eastAsia="Times New Roman" w:hAnsi="Aptos Narrow" w:cs="Times New Roman"/>
+                <w:color w:val="000000"/>
+                <w:kern w:val="0"/>
+                <w:sz w:val="22"/>
+                <w:szCs w:val="22"/>
+                <w:lang w:eastAsia="pt-BR"/>
+                <w14:ligatures w14:val="none"/>
+              </w:rPr>
+            </w:pPr>
+            <w:r>
+              <w:rPr>
+                <w:rFonts w:ascii="Aptos Narrow" w:eastAsia="Times New Roman" w:hAnsi="Aptos Narrow" w:cs="Times New Roman"/>
+                <w:color w:val="000000"/>
+                <w:kern w:val="0"/>
+                <w:sz w:val="22"/>
+                <w:szCs w:val="22"/>
+                <w:lang w:eastAsia="pt-BR"/>
+                <w14:ligatures w14:val="none"/>
+              </w:rPr>
+              <w:t>2</w:t>
+            </w:r>
+          </w:p>
+        </w:tc>
+        <w:tc>
+          <w:tcPr>
+            <w:tcW w:w="800" w:type="dxa"/>
+            <w:tcBorders>
+              <w:top w:val="single" w:sz="4" w:space="0" w:color="auto"/>
+              <w:left w:val="nil"/>
+              <w:bottom w:val="single" w:sz="4" w:space="0" w:color="auto"/>
+              <w:right w:val="single" w:sz="4" w:space="0" w:color="auto"/>
+            </w:tcBorders>
+            <w:shd w:val="clear" w:color="auto" w:fill="auto"/>
+            <w:noWrap/>
+            <w:vAlign w:val="center"/>
+            <w:hideMark/>
+          </w:tcPr>
+          <w:p>
+            <w:pPr>
+              <w:spacing w:after="0" w:line="240" w:lineRule="auto"/>
+              <w:ind w:firstLine="0"/>
+              <w:jc w:val="center"/>
+              <w:rPr>
+                <w:rFonts w:ascii="Aptos Narrow" w:eastAsia="Times New Roman" w:hAnsi="Aptos Narrow" w:cs="Times New Roman"/>
+                <w:color w:val="000000"/>
+                <w:kern w:val="0"/>
+                <w:sz w:val="22"/>
+                <w:szCs w:val="22"/>
+                <w:lang w:eastAsia="pt-BR"/>
+                <w14:ligatures w14:val="none"/>
+              </w:rPr>
+            </w:pPr>
+            <w:r>
+              <w:rPr>
+                <w:rFonts w:ascii="Aptos Narrow" w:eastAsia="Times New Roman" w:hAnsi="Aptos Narrow" w:cs="Times New Roman"/>
+                <w:color w:val="000000"/>
+                <w:kern w:val="0"/>
+                <w:sz w:val="22"/>
+                <w:szCs w:val="22"/>
+                <w:lang w:eastAsia="pt-BR"/>
+                <w14:ligatures w14:val="none"/>
+              </w:rPr>
+              <w:t>2</w:t>
+            </w:r>
+          </w:p>
+        </w:tc>
+        <w:tc>
+          <w:tcPr>
+            <w:tcW w:w="780" w:type="dxa"/>
+            <w:tcBorders>
+              <w:top w:val="nil"/>
+              <w:left w:val="nil"/>
+              <w:bottom w:val="single" w:sz="4" w:space="0" w:color="auto"/>
+              <w:right w:val="single" w:sz="4" w:space="0" w:color="auto"/>
+            </w:tcBorders>
+            <w:shd w:val="clear" w:color="auto" w:fill="auto"/>
+            <w:noWrap/>
+            <w:vAlign w:val="center"/>
+            <w:hideMark/>
+          </w:tcPr>
+          <w:p>
+            <w:pPr>
+              <w:spacing w:after="0" w:line="240" w:lineRule="auto"/>
+              <w:ind w:firstLine="0"/>
+              <w:jc w:val="center"/>
+              <w:rPr>
+                <w:rFonts w:ascii="Aptos Narrow" w:eastAsia="Times New Roman" w:hAnsi="Aptos Narrow" w:cs="Times New Roman"/>
+                <w:color w:val="000000"/>
+                <w:kern w:val="0"/>
+                <w:sz w:val="22"/>
+                <w:szCs w:val="22"/>
+                <w:lang w:eastAsia="pt-BR"/>
+                <w14:ligatures w14:val="none"/>
+              </w:rPr>
+            </w:pPr>
+            <w:r>
+              <w:rPr>
+                <w:rFonts w:ascii="Aptos Narrow" w:eastAsia="Times New Roman" w:hAnsi="Aptos Narrow" w:cs="Times New Roman"/>
+                <w:color w:val="000000"/>
+                <w:kern w:val="0"/>
+                <w:sz w:val="22"/>
+                <w:szCs w:val="22"/>
+                <w:lang w:eastAsia="pt-BR"/>
+                <w14:ligatures w14:val="none"/>
+              </w:rPr>
+              <w:t>Mitigar</w:t>
+            </w:r>
+          </w:p>
+        </w:tc>
+        <w:tc>
+          <w:tcPr>
+            <w:tcW w:w="2500" w:type="dxa"/>
+            <w:tcBorders>
+              <w:top w:val="single" w:sz="4" w:space="0" w:color="auto"/>
+              <w:left w:val="nil"/>
+              <w:bottom w:val="single" w:sz="4" w:space="0" w:color="auto"/>
+              <w:right w:val="single" w:sz="8" w:space="0" w:color="000000"/>
+            </w:tcBorders>
+            <w:shd w:val="clear" w:color="auto" w:fill="auto"/>
+            <w:vAlign w:val="center"/>
+            <w:hideMark/>
+          </w:tcPr>
+          <w:p>
+            <w:pPr>
+              <w:spacing w:after="0" w:line="240" w:lineRule="auto"/>
+              <w:ind w:firstLine="0"/>
+              <w:rPr>
+                <w:rFonts w:ascii="Aptos Narrow" w:eastAsia="Times New Roman" w:hAnsi="Aptos Narrow" w:cs="Times New Roman"/>
+                <w:color w:val="000000"/>
+                <w:kern w:val="0"/>
+                <w:sz w:val="22"/>
+                <w:szCs w:val="22"/>
+                <w:lang w:eastAsia="pt-BR"/>
+                <w14:ligatures w14:val="none"/>
+              </w:rPr>
+            </w:pPr>
+            <w:r>
+              <w:rPr>
+                <w:rFonts w:ascii="Aptos Narrow" w:eastAsia="Times New Roman" w:hAnsi="Aptos Narrow" w:cs="Times New Roman"/>
+                <w:color w:val="000000"/>
+                <w:kern w:val="0"/>
+                <w:sz w:val="22"/>
+                <w:szCs w:val="22"/>
+                <w:lang w:eastAsia="pt-BR"/>
+                <w14:ligatures w14:val="none"/>
+              </w:rPr>
+              <w:t xml:space="preserve">Comunicação sempre clara com a equipe e se necessário contato com a liderança </w:t>
+            </w:r>
+          </w:p>
+        </w:tc>
+      </w:tr>
+      <w:tr>
+        <w:trPr>
+          <w:trHeight w:val="624"/>
+        </w:trPr>
+        <w:tc>
+          <w:tcPr>
+            <w:tcW w:w="580" w:type="dxa"/>
+            <w:tcBorders>
+              <w:top w:val="nil"/>
+              <w:left w:val="single" w:sz="8" w:space="0" w:color="auto"/>
+              <w:bottom w:val="single" w:sz="4" w:space="0" w:color="auto"/>
+              <w:right w:val="single" w:sz="4" w:space="0" w:color="auto"/>
+            </w:tcBorders>
+            <w:shd w:val="clear" w:color="auto" w:fill="auto"/>
+            <w:noWrap/>
+            <w:vAlign w:val="center"/>
+            <w:hideMark/>
+          </w:tcPr>
+          <w:p>
+            <w:pPr>
+              <w:spacing w:after="0" w:line="240" w:lineRule="auto"/>
+              <w:ind w:firstLine="0"/>
+              <w:jc w:val="center"/>
+              <w:rPr>
+                <w:rFonts w:ascii="Aptos Narrow" w:eastAsia="Times New Roman" w:hAnsi="Aptos Narrow" w:cs="Times New Roman"/>
+                <w:color w:val="000000"/>
+                <w:kern w:val="0"/>
+                <w:sz w:val="22"/>
+                <w:szCs w:val="22"/>
+                <w:lang w:eastAsia="pt-BR"/>
+                <w14:ligatures w14:val="none"/>
+              </w:rPr>
+            </w:pPr>
+            <w:r>
+              <w:rPr>
+                <w:rFonts w:ascii="Aptos Narrow" w:eastAsia="Times New Roman" w:hAnsi="Aptos Narrow" w:cs="Times New Roman"/>
+                <w:color w:val="000000"/>
+                <w:kern w:val="0"/>
+                <w:sz w:val="22"/>
+                <w:szCs w:val="22"/>
+                <w:lang w:eastAsia="pt-BR"/>
+                <w14:ligatures w14:val="none"/>
+              </w:rPr>
+              <w:t>5</w:t>
+            </w:r>
+          </w:p>
+        </w:tc>
+        <w:tc>
+          <w:tcPr>
+            <w:tcW w:w="2320" w:type="dxa"/>
+            <w:tcBorders>
+              <w:top w:val="single" w:sz="4" w:space="0" w:color="auto"/>
+              <w:left w:val="nil"/>
+              <w:bottom w:val="single" w:sz="4" w:space="0" w:color="auto"/>
+              <w:right w:val="single" w:sz="4" w:space="0" w:color="auto"/>
+            </w:tcBorders>
+            <w:shd w:val="clear" w:color="auto" w:fill="auto"/>
+            <w:vAlign w:val="center"/>
+            <w:hideMark/>
+          </w:tcPr>
+          <w:p>
+            <w:pPr>
+              <w:spacing w:after="0" w:line="240" w:lineRule="auto"/>
+              <w:ind w:firstLine="0"/>
+              <w:jc w:val="left"/>
+              <w:rPr>
+                <w:rFonts w:ascii="Aptos Narrow" w:eastAsia="Times New Roman" w:hAnsi="Aptos Narrow" w:cs="Times New Roman"/>
+                <w:color w:val="000000"/>
+                <w:kern w:val="0"/>
+                <w:sz w:val="22"/>
+                <w:szCs w:val="22"/>
+                <w:lang w:eastAsia="pt-BR"/>
+                <w14:ligatures w14:val="none"/>
+              </w:rPr>
+            </w:pPr>
+            <w:r>
+              <w:rPr>
+                <w:rFonts w:ascii="Aptos Narrow" w:eastAsia="Times New Roman" w:hAnsi="Aptos Narrow" w:cs="Times New Roman"/>
+                <w:color w:val="000000"/>
+                <w:kern w:val="0"/>
+                <w:sz w:val="22"/>
+                <w:szCs w:val="22"/>
+                <w:lang w:eastAsia="pt-BR"/>
+                <w14:ligatures w14:val="none"/>
+              </w:rPr>
+              <w:t>Falha no funcionamento do sensor</w:t>
+            </w:r>
+          </w:p>
+        </w:tc>
+        <w:tc>
+          <w:tcPr>
+            <w:tcW w:w="1280" w:type="dxa"/>
+            <w:tcBorders>
+              <w:top w:val="single" w:sz="4" w:space="0" w:color="auto"/>
+              <w:left w:val="nil"/>
+              <w:bottom w:val="single" w:sz="4" w:space="0" w:color="auto"/>
+              <w:right w:val="single" w:sz="4" w:space="0" w:color="auto"/>
+            </w:tcBorders>
+            <w:shd w:val="clear" w:color="auto" w:fill="auto"/>
+            <w:noWrap/>
+            <w:vAlign w:val="center"/>
+            <w:hideMark/>
+          </w:tcPr>
+          <w:p>
+            <w:pPr>
+              <w:spacing w:after="0" w:line="240" w:lineRule="auto"/>
+              <w:ind w:firstLine="0"/>
+              <w:jc w:val="center"/>
+              <w:rPr>
+                <w:rFonts w:ascii="Aptos Narrow" w:eastAsia="Times New Roman" w:hAnsi="Aptos Narrow" w:cs="Times New Roman"/>
+                <w:color w:val="000000"/>
+                <w:kern w:val="0"/>
+                <w:sz w:val="22"/>
+                <w:szCs w:val="22"/>
+                <w:lang w:eastAsia="pt-BR"/>
+                <w14:ligatures w14:val="none"/>
+              </w:rPr>
+            </w:pPr>
+            <w:r>
+              <w:rPr>
+                <w:rFonts w:ascii="Aptos Narrow" w:eastAsia="Times New Roman" w:hAnsi="Aptos Narrow" w:cs="Times New Roman"/>
+                <w:color w:val="000000"/>
+                <w:kern w:val="0"/>
+                <w:sz w:val="22"/>
+                <w:szCs w:val="22"/>
+                <w:lang w:eastAsia="pt-BR"/>
+                <w14:ligatures w14:val="none"/>
+              </w:rPr>
+              <w:t>2</w:t>
+            </w:r>
+          </w:p>
+        </w:tc>
+        <w:tc>
+          <w:tcPr>
+            <w:tcW w:w="800" w:type="dxa"/>
+            <w:tcBorders>
+              <w:top w:val="single" w:sz="4" w:space="0" w:color="auto"/>
+              <w:left w:val="nil"/>
+              <w:bottom w:val="single" w:sz="4" w:space="0" w:color="auto"/>
+              <w:right w:val="single" w:sz="4" w:space="0" w:color="auto"/>
+            </w:tcBorders>
+            <w:shd w:val="clear" w:color="auto" w:fill="auto"/>
+            <w:noWrap/>
+            <w:vAlign w:val="center"/>
+            <w:hideMark/>
+          </w:tcPr>
+          <w:p>
+            <w:pPr>
+              <w:spacing w:after="0" w:line="240" w:lineRule="auto"/>
+              <w:ind w:firstLine="0"/>
+              <w:jc w:val="center"/>
+              <w:rPr>
+                <w:rFonts w:ascii="Aptos Narrow" w:eastAsia="Times New Roman" w:hAnsi="Aptos Narrow" w:cs="Times New Roman"/>
+                <w:color w:val="000000"/>
+                <w:kern w:val="0"/>
+                <w:sz w:val="22"/>
+                <w:szCs w:val="22"/>
+                <w:lang w:eastAsia="pt-BR"/>
+                <w14:ligatures w14:val="none"/>
+              </w:rPr>
+            </w:pPr>
+            <w:r>
+              <w:rPr>
+                <w:rFonts w:ascii="Aptos Narrow" w:eastAsia="Times New Roman" w:hAnsi="Aptos Narrow" w:cs="Times New Roman"/>
+                <w:color w:val="000000"/>
+                <w:kern w:val="0"/>
+                <w:sz w:val="22"/>
+                <w:szCs w:val="22"/>
+                <w:lang w:eastAsia="pt-BR"/>
+                <w14:ligatures w14:val="none"/>
+              </w:rPr>
+              <w:t>3</w:t>
+            </w:r>
+          </w:p>
+        </w:tc>
+        <w:tc>
+          <w:tcPr>
+            <w:tcW w:w="800" w:type="dxa"/>
+            <w:tcBorders>
+              <w:top w:val="single" w:sz="4" w:space="0" w:color="auto"/>
+              <w:left w:val="nil"/>
+              <w:bottom w:val="single" w:sz="4" w:space="0" w:color="auto"/>
+              <w:right w:val="single" w:sz="4" w:space="0" w:color="auto"/>
+            </w:tcBorders>
+            <w:shd w:val="clear" w:color="auto" w:fill="auto"/>
+            <w:noWrap/>
+            <w:vAlign w:val="center"/>
+            <w:hideMark/>
+          </w:tcPr>
+          <w:p>
+            <w:pPr>
+              <w:spacing w:after="0" w:line="240" w:lineRule="auto"/>
+              <w:ind w:firstLine="0"/>
+              <w:jc w:val="center"/>
+              <w:rPr>
+                <w:rFonts w:ascii="Aptos Narrow" w:eastAsia="Times New Roman" w:hAnsi="Aptos Narrow" w:cs="Times New Roman"/>
+                <w:color w:val="000000"/>
+                <w:kern w:val="0"/>
+                <w:sz w:val="22"/>
+                <w:szCs w:val="22"/>
+                <w:lang w:eastAsia="pt-BR"/>
+                <w14:ligatures w14:val="none"/>
+              </w:rPr>
+            </w:pPr>
+            <w:r>
+              <w:rPr>
+                <w:rFonts w:ascii="Aptos Narrow" w:eastAsia="Times New Roman" w:hAnsi="Aptos Narrow" w:cs="Times New Roman"/>
+                <w:color w:val="000000"/>
+                <w:kern w:val="0"/>
+                <w:sz w:val="22"/>
+                <w:szCs w:val="22"/>
+                <w:lang w:eastAsia="pt-BR"/>
+                <w14:ligatures w14:val="none"/>
+              </w:rPr>
+              <w:t>6</w:t>
+            </w:r>
+          </w:p>
+        </w:tc>
+        <w:tc>
+          <w:tcPr>
+            <w:tcW w:w="780" w:type="dxa"/>
+            <w:tcBorders>
+              <w:top w:val="nil"/>
+              <w:left w:val="nil"/>
+              <w:bottom w:val="single" w:sz="4" w:space="0" w:color="auto"/>
+              <w:right w:val="single" w:sz="4" w:space="0" w:color="auto"/>
+            </w:tcBorders>
+            <w:shd w:val="clear" w:color="auto" w:fill="auto"/>
+            <w:noWrap/>
+            <w:vAlign w:val="center"/>
+            <w:hideMark/>
+          </w:tcPr>
+          <w:p>
+            <w:pPr>
+              <w:spacing w:after="0" w:line="240" w:lineRule="auto"/>
+              <w:ind w:firstLine="0"/>
+              <w:jc w:val="center"/>
+              <w:rPr>
+                <w:rFonts w:ascii="Aptos Narrow" w:eastAsia="Times New Roman" w:hAnsi="Aptos Narrow" w:cs="Times New Roman"/>
+                <w:color w:val="000000"/>
+                <w:kern w:val="0"/>
+                <w:sz w:val="22"/>
+                <w:szCs w:val="22"/>
+                <w:lang w:eastAsia="pt-BR"/>
+                <w14:ligatures w14:val="none"/>
+              </w:rPr>
+            </w:pPr>
+            <w:r>
+              <w:rPr>
+                <w:rFonts w:ascii="Aptos Narrow" w:eastAsia="Times New Roman" w:hAnsi="Aptos Narrow" w:cs="Times New Roman"/>
+                <w:color w:val="000000"/>
+                <w:kern w:val="0"/>
+                <w:sz w:val="22"/>
+                <w:szCs w:val="22"/>
+                <w:lang w:eastAsia="pt-BR"/>
+                <w14:ligatures w14:val="none"/>
+              </w:rPr>
+              <w:t>Mitigar</w:t>
+            </w:r>
+          </w:p>
+        </w:tc>
+        <w:tc>
+          <w:tcPr>
+            <w:tcW w:w="2500" w:type="dxa"/>
+            <w:tcBorders>
+              <w:top w:val="single" w:sz="4" w:space="0" w:color="auto"/>
+              <w:left w:val="nil"/>
+              <w:bottom w:val="single" w:sz="4" w:space="0" w:color="auto"/>
+              <w:right w:val="single" w:sz="8" w:space="0" w:color="000000"/>
+            </w:tcBorders>
+            <w:shd w:val="clear" w:color="auto" w:fill="auto"/>
+            <w:noWrap/>
+            <w:vAlign w:val="center"/>
+            <w:hideMark/>
+          </w:tcPr>
+          <w:p>
+            <w:pPr>
+              <w:spacing w:after="0" w:line="240" w:lineRule="auto"/>
+              <w:ind w:firstLine="0"/>
+              <w:rPr>
+                <w:rFonts w:ascii="Aptos Narrow" w:eastAsia="Times New Roman" w:hAnsi="Aptos Narrow" w:cs="Times New Roman"/>
+                <w:color w:val="000000"/>
+                <w:kern w:val="0"/>
+                <w:sz w:val="22"/>
+                <w:szCs w:val="22"/>
+                <w:lang w:eastAsia="pt-BR"/>
+                <w14:ligatures w14:val="none"/>
+              </w:rPr>
+            </w:pPr>
+            <w:r>
+              <w:rPr>
+                <w:rFonts w:ascii="Aptos Narrow" w:eastAsia="Times New Roman" w:hAnsi="Aptos Narrow" w:cs="Times New Roman"/>
+                <w:color w:val="000000"/>
+                <w:kern w:val="0"/>
+                <w:sz w:val="22"/>
+                <w:szCs w:val="22"/>
+                <w:lang w:eastAsia="pt-BR"/>
+                <w14:ligatures w14:val="none"/>
+              </w:rPr>
+              <w:t>Manutenção Periódica</w:t>
+            </w:r>
+          </w:p>
+        </w:tc>
+      </w:tr>
+      <w:tr>
+        <w:trPr>
+          <w:trHeight w:val="936"/>
+        </w:trPr>
+        <w:tc>
+          <w:tcPr>
+            <w:tcW w:w="580" w:type="dxa"/>
+            <w:tcBorders>
+              <w:top w:val="nil"/>
+              <w:left w:val="single" w:sz="8" w:space="0" w:color="auto"/>
+              <w:bottom w:val="single" w:sz="4" w:space="0" w:color="auto"/>
+              <w:right w:val="single" w:sz="4" w:space="0" w:color="auto"/>
+            </w:tcBorders>
+            <w:shd w:val="clear" w:color="auto" w:fill="auto"/>
+            <w:noWrap/>
+            <w:vAlign w:val="center"/>
+            <w:hideMark/>
+          </w:tcPr>
+          <w:p>
+            <w:pPr>
+              <w:spacing w:after="0" w:line="240" w:lineRule="auto"/>
+              <w:ind w:firstLine="0"/>
+              <w:jc w:val="center"/>
+              <w:rPr>
+                <w:rFonts w:ascii="Aptos Narrow" w:eastAsia="Times New Roman" w:hAnsi="Aptos Narrow" w:cs="Times New Roman"/>
+                <w:color w:val="000000"/>
+                <w:kern w:val="0"/>
+                <w:sz w:val="22"/>
+                <w:szCs w:val="22"/>
+                <w:lang w:eastAsia="pt-BR"/>
+                <w14:ligatures w14:val="none"/>
+              </w:rPr>
+            </w:pPr>
+            <w:r>
+              <w:rPr>
+                <w:rFonts w:ascii="Aptos Narrow" w:eastAsia="Times New Roman" w:hAnsi="Aptos Narrow" w:cs="Times New Roman"/>
+                <w:color w:val="000000"/>
+                <w:kern w:val="0"/>
+                <w:sz w:val="22"/>
+                <w:szCs w:val="22"/>
+                <w:lang w:eastAsia="pt-BR"/>
+                <w14:ligatures w14:val="none"/>
+              </w:rPr>
+              <w:t>6</w:t>
+            </w:r>
+          </w:p>
+        </w:tc>
+        <w:tc>
+          <w:tcPr>
+            <w:tcW w:w="2320" w:type="dxa"/>
+            <w:tcBorders>
+              <w:top w:val="single" w:sz="4" w:space="0" w:color="auto"/>
+              <w:left w:val="nil"/>
+              <w:bottom w:val="single" w:sz="4" w:space="0" w:color="auto"/>
+              <w:right w:val="single" w:sz="4" w:space="0" w:color="auto"/>
+            </w:tcBorders>
+            <w:shd w:val="clear" w:color="auto" w:fill="auto"/>
+            <w:vAlign w:val="center"/>
+            <w:hideMark/>
+          </w:tcPr>
+          <w:p>
+            <w:pPr>
+              <w:spacing w:after="0" w:line="240" w:lineRule="auto"/>
+              <w:ind w:firstLine="0"/>
+              <w:jc w:val="left"/>
+              <w:rPr>
+                <w:rFonts w:ascii="Aptos Narrow" w:eastAsia="Times New Roman" w:hAnsi="Aptos Narrow" w:cs="Times New Roman"/>
+                <w:color w:val="000000"/>
+                <w:kern w:val="0"/>
+                <w:sz w:val="22"/>
+                <w:szCs w:val="22"/>
+                <w:lang w:eastAsia="pt-BR"/>
+                <w14:ligatures w14:val="none"/>
+              </w:rPr>
+            </w:pPr>
+            <w:r>
+              <w:rPr>
+                <w:rFonts w:ascii="Aptos Narrow" w:eastAsia="Times New Roman" w:hAnsi="Aptos Narrow" w:cs="Times New Roman"/>
+                <w:color w:val="000000"/>
+                <w:kern w:val="0"/>
+                <w:sz w:val="22"/>
+                <w:szCs w:val="22"/>
+                <w:lang w:eastAsia="pt-BR"/>
+                <w14:ligatures w14:val="none"/>
+              </w:rPr>
+              <w:t xml:space="preserve">Alteração no </w:t>
+            </w:r>
+            <w:proofErr w:type="gramStart"/>
+            <w:r>
+              <w:rPr>
+                <w:rFonts w:ascii="Aptos Narrow" w:eastAsia="Times New Roman" w:hAnsi="Aptos Narrow" w:cs="Times New Roman"/>
+                <w:color w:val="000000"/>
+                <w:kern w:val="0"/>
+                <w:sz w:val="22"/>
+                <w:szCs w:val="22"/>
+                <w:lang w:eastAsia="pt-BR"/>
+                <w14:ligatures w14:val="none"/>
+              </w:rPr>
+              <w:t>escopo  durante</w:t>
+            </w:r>
+            <w:proofErr w:type="gramEnd"/>
+            <w:r>
+              <w:rPr>
+                <w:rFonts w:ascii="Aptos Narrow" w:eastAsia="Times New Roman" w:hAnsi="Aptos Narrow" w:cs="Times New Roman"/>
+                <w:color w:val="000000"/>
+                <w:kern w:val="0"/>
+                <w:sz w:val="22"/>
+                <w:szCs w:val="22"/>
+                <w:lang w:eastAsia="pt-BR"/>
+                <w14:ligatures w14:val="none"/>
+              </w:rPr>
+              <w:t xml:space="preserve"> a execução do projeto</w:t>
+            </w:r>
+          </w:p>
+        </w:tc>
+        <w:tc>
+          <w:tcPr>
+            <w:tcW w:w="1280" w:type="dxa"/>
+            <w:tcBorders>
+              <w:top w:val="single" w:sz="4" w:space="0" w:color="auto"/>
+              <w:left w:val="nil"/>
+              <w:bottom w:val="single" w:sz="4" w:space="0" w:color="auto"/>
+              <w:right w:val="single" w:sz="4" w:space="0" w:color="auto"/>
+            </w:tcBorders>
+            <w:shd w:val="clear" w:color="auto" w:fill="auto"/>
+            <w:noWrap/>
+            <w:vAlign w:val="center"/>
+            <w:hideMark/>
+          </w:tcPr>
+          <w:p>
+            <w:pPr>
+              <w:spacing w:after="0" w:line="240" w:lineRule="auto"/>
+              <w:ind w:firstLine="0"/>
+              <w:jc w:val="center"/>
+              <w:rPr>
+                <w:rFonts w:ascii="Aptos Narrow" w:eastAsia="Times New Roman" w:hAnsi="Aptos Narrow" w:cs="Times New Roman"/>
+                <w:color w:val="000000"/>
+                <w:kern w:val="0"/>
+                <w:sz w:val="22"/>
+                <w:szCs w:val="22"/>
+                <w:lang w:eastAsia="pt-BR"/>
+                <w14:ligatures w14:val="none"/>
+              </w:rPr>
+            </w:pPr>
+            <w:r>
+              <w:rPr>
+                <w:rFonts w:ascii="Aptos Narrow" w:eastAsia="Times New Roman" w:hAnsi="Aptos Narrow" w:cs="Times New Roman"/>
+                <w:color w:val="000000"/>
+                <w:kern w:val="0"/>
+                <w:sz w:val="22"/>
+                <w:szCs w:val="22"/>
+                <w:lang w:eastAsia="pt-BR"/>
+                <w14:ligatures w14:val="none"/>
+              </w:rPr>
+              <w:t>1</w:t>
+            </w:r>
+          </w:p>
+        </w:tc>
+        <w:tc>
+          <w:tcPr>
+            <w:tcW w:w="800" w:type="dxa"/>
+            <w:tcBorders>
+              <w:top w:val="single" w:sz="4" w:space="0" w:color="auto"/>
+              <w:left w:val="nil"/>
+              <w:bottom w:val="single" w:sz="4" w:space="0" w:color="auto"/>
+              <w:right w:val="single" w:sz="4" w:space="0" w:color="auto"/>
+            </w:tcBorders>
+            <w:shd w:val="clear" w:color="auto" w:fill="auto"/>
+            <w:noWrap/>
+            <w:vAlign w:val="center"/>
+            <w:hideMark/>
+          </w:tcPr>
+          <w:p>
+            <w:pPr>
+              <w:spacing w:after="0" w:line="240" w:lineRule="auto"/>
+              <w:ind w:firstLine="0"/>
+              <w:jc w:val="center"/>
+              <w:rPr>
+                <w:rFonts w:ascii="Aptos Narrow" w:eastAsia="Times New Roman" w:hAnsi="Aptos Narrow" w:cs="Times New Roman"/>
+                <w:color w:val="000000"/>
+                <w:kern w:val="0"/>
+                <w:sz w:val="22"/>
+                <w:szCs w:val="22"/>
+                <w:lang w:eastAsia="pt-BR"/>
+                <w14:ligatures w14:val="none"/>
+              </w:rPr>
+            </w:pPr>
+            <w:r>
+              <w:rPr>
+                <w:rFonts w:ascii="Aptos Narrow" w:eastAsia="Times New Roman" w:hAnsi="Aptos Narrow" w:cs="Times New Roman"/>
+                <w:color w:val="000000"/>
+                <w:kern w:val="0"/>
+                <w:sz w:val="22"/>
+                <w:szCs w:val="22"/>
+                <w:lang w:eastAsia="pt-BR"/>
+                <w14:ligatures w14:val="none"/>
+              </w:rPr>
+              <w:t>3</w:t>
+            </w:r>
+          </w:p>
+        </w:tc>
+        <w:tc>
+          <w:tcPr>
+            <w:tcW w:w="800" w:type="dxa"/>
+            <w:tcBorders>
+              <w:top w:val="single" w:sz="4" w:space="0" w:color="auto"/>
+              <w:left w:val="nil"/>
+              <w:bottom w:val="single" w:sz="4" w:space="0" w:color="auto"/>
+              <w:right w:val="single" w:sz="4" w:space="0" w:color="auto"/>
+            </w:tcBorders>
+            <w:shd w:val="clear" w:color="auto" w:fill="auto"/>
+            <w:noWrap/>
+            <w:vAlign w:val="center"/>
+            <w:hideMark/>
+          </w:tcPr>
+          <w:p>
+            <w:pPr>
+              <w:spacing w:after="0" w:line="240" w:lineRule="auto"/>
+              <w:ind w:firstLine="0"/>
+              <w:jc w:val="center"/>
+              <w:rPr>
+                <w:rFonts w:ascii="Aptos Narrow" w:eastAsia="Times New Roman" w:hAnsi="Aptos Narrow" w:cs="Times New Roman"/>
+                <w:color w:val="000000"/>
+                <w:kern w:val="0"/>
+                <w:sz w:val="22"/>
+                <w:szCs w:val="22"/>
+                <w:lang w:eastAsia="pt-BR"/>
+                <w14:ligatures w14:val="none"/>
+              </w:rPr>
+            </w:pPr>
+            <w:r>
+              <w:rPr>
+                <w:rFonts w:ascii="Aptos Narrow" w:eastAsia="Times New Roman" w:hAnsi="Aptos Narrow" w:cs="Times New Roman"/>
+                <w:color w:val="000000"/>
+                <w:kern w:val="0"/>
+                <w:sz w:val="22"/>
+                <w:szCs w:val="22"/>
+                <w:lang w:eastAsia="pt-BR"/>
+                <w14:ligatures w14:val="none"/>
+              </w:rPr>
+              <w:t>3</w:t>
+            </w:r>
+          </w:p>
+        </w:tc>
+        <w:tc>
+          <w:tcPr>
+            <w:tcW w:w="780" w:type="dxa"/>
+            <w:tcBorders>
+              <w:top w:val="nil"/>
+              <w:left w:val="nil"/>
+              <w:bottom w:val="single" w:sz="4" w:space="0" w:color="auto"/>
+              <w:right w:val="single" w:sz="4" w:space="0" w:color="auto"/>
+            </w:tcBorders>
+            <w:shd w:val="clear" w:color="auto" w:fill="auto"/>
+            <w:noWrap/>
+            <w:vAlign w:val="center"/>
+            <w:hideMark/>
+          </w:tcPr>
+          <w:p>
+            <w:pPr>
+              <w:spacing w:after="0" w:line="240" w:lineRule="auto"/>
+              <w:ind w:firstLine="0"/>
+              <w:jc w:val="center"/>
+              <w:rPr>
+                <w:rFonts w:ascii="Aptos Narrow" w:eastAsia="Times New Roman" w:hAnsi="Aptos Narrow" w:cs="Times New Roman"/>
+                <w:color w:val="000000"/>
+                <w:kern w:val="0"/>
+                <w:sz w:val="22"/>
+                <w:szCs w:val="22"/>
+                <w:lang w:eastAsia="pt-BR"/>
+                <w14:ligatures w14:val="none"/>
+              </w:rPr>
+            </w:pPr>
+            <w:r>
+              <w:rPr>
+                <w:rFonts w:ascii="Aptos Narrow" w:eastAsia="Times New Roman" w:hAnsi="Aptos Narrow" w:cs="Times New Roman"/>
+                <w:color w:val="000000"/>
+                <w:kern w:val="0"/>
+                <w:sz w:val="22"/>
+                <w:szCs w:val="22"/>
+                <w:lang w:eastAsia="pt-BR"/>
+                <w14:ligatures w14:val="none"/>
+              </w:rPr>
+              <w:t>Evitar</w:t>
+            </w:r>
+          </w:p>
+        </w:tc>
+        <w:tc>
+          <w:tcPr>
+            <w:tcW w:w="2500" w:type="dxa"/>
+            <w:tcBorders>
+              <w:top w:val="single" w:sz="4" w:space="0" w:color="auto"/>
+              <w:left w:val="nil"/>
+              <w:bottom w:val="single" w:sz="4" w:space="0" w:color="auto"/>
+              <w:right w:val="single" w:sz="8" w:space="0" w:color="000000"/>
+            </w:tcBorders>
+            <w:shd w:val="clear" w:color="auto" w:fill="auto"/>
+            <w:vAlign w:val="center"/>
+            <w:hideMark/>
+          </w:tcPr>
+          <w:p>
+            <w:pPr>
+              <w:spacing w:after="0" w:line="240" w:lineRule="auto"/>
+              <w:ind w:firstLine="0"/>
+              <w:rPr>
+                <w:rFonts w:ascii="Aptos Narrow" w:eastAsia="Times New Roman" w:hAnsi="Aptos Narrow" w:cs="Times New Roman"/>
+                <w:color w:val="000000"/>
+                <w:kern w:val="0"/>
+                <w:sz w:val="22"/>
+                <w:szCs w:val="22"/>
+                <w:lang w:eastAsia="pt-BR"/>
+                <w14:ligatures w14:val="none"/>
+              </w:rPr>
+            </w:pPr>
+            <w:r>
+              <w:rPr>
+                <w:rFonts w:ascii="Aptos Narrow" w:eastAsia="Times New Roman" w:hAnsi="Aptos Narrow" w:cs="Times New Roman"/>
+                <w:color w:val="000000"/>
+                <w:kern w:val="0"/>
+                <w:sz w:val="22"/>
+                <w:szCs w:val="22"/>
+                <w:lang w:eastAsia="pt-BR"/>
+                <w14:ligatures w14:val="none"/>
+              </w:rPr>
+              <w:t>Comunicar ao cliente que o escopo do projeto é fixo</w:t>
+            </w:r>
+          </w:p>
+        </w:tc>
+      </w:tr>
+      <w:tr>
+        <w:trPr>
+          <w:trHeight w:val="936"/>
+        </w:trPr>
+        <w:tc>
+          <w:tcPr>
+            <w:tcW w:w="580" w:type="dxa"/>
+            <w:tcBorders>
+              <w:top w:val="nil"/>
+              <w:left w:val="single" w:sz="8" w:space="0" w:color="auto"/>
+              <w:bottom w:val="single" w:sz="4" w:space="0" w:color="auto"/>
+              <w:right w:val="single" w:sz="4" w:space="0" w:color="auto"/>
+            </w:tcBorders>
+            <w:shd w:val="clear" w:color="auto" w:fill="auto"/>
+            <w:noWrap/>
+            <w:vAlign w:val="center"/>
+            <w:hideMark/>
+          </w:tcPr>
+          <w:p>
+            <w:pPr>
+              <w:spacing w:after="0" w:line="240" w:lineRule="auto"/>
+              <w:ind w:firstLine="0"/>
+              <w:jc w:val="center"/>
+              <w:rPr>
+                <w:rFonts w:ascii="Aptos Narrow" w:eastAsia="Times New Roman" w:hAnsi="Aptos Narrow" w:cs="Times New Roman"/>
+                <w:color w:val="000000"/>
+                <w:kern w:val="0"/>
+                <w:sz w:val="22"/>
+                <w:szCs w:val="22"/>
+                <w:lang w:eastAsia="pt-BR"/>
+                <w14:ligatures w14:val="none"/>
+              </w:rPr>
+            </w:pPr>
+            <w:r>
+              <w:rPr>
+                <w:rFonts w:ascii="Aptos Narrow" w:eastAsia="Times New Roman" w:hAnsi="Aptos Narrow" w:cs="Times New Roman"/>
+                <w:color w:val="000000"/>
+                <w:kern w:val="0"/>
+                <w:sz w:val="22"/>
+                <w:szCs w:val="22"/>
+                <w:lang w:eastAsia="pt-BR"/>
+                <w14:ligatures w14:val="none"/>
+              </w:rPr>
+              <w:t>7</w:t>
+            </w:r>
+          </w:p>
+        </w:tc>
+        <w:tc>
+          <w:tcPr>
+            <w:tcW w:w="2320" w:type="dxa"/>
+            <w:tcBorders>
+              <w:top w:val="single" w:sz="4" w:space="0" w:color="auto"/>
+              <w:left w:val="nil"/>
+              <w:bottom w:val="single" w:sz="4" w:space="0" w:color="auto"/>
+              <w:right w:val="single" w:sz="4" w:space="0" w:color="auto"/>
+            </w:tcBorders>
+            <w:shd w:val="clear" w:color="auto" w:fill="auto"/>
+            <w:vAlign w:val="center"/>
+            <w:hideMark/>
+          </w:tcPr>
+          <w:p>
+            <w:pPr>
+              <w:spacing w:after="0" w:line="240" w:lineRule="auto"/>
+              <w:ind w:firstLine="0"/>
+              <w:jc w:val="left"/>
+              <w:rPr>
+                <w:rFonts w:ascii="Aptos Narrow" w:eastAsia="Times New Roman" w:hAnsi="Aptos Narrow" w:cs="Times New Roman"/>
+                <w:color w:val="000000"/>
+                <w:kern w:val="0"/>
+                <w:sz w:val="22"/>
+                <w:szCs w:val="22"/>
+                <w:lang w:eastAsia="pt-BR"/>
+                <w14:ligatures w14:val="none"/>
+              </w:rPr>
+            </w:pPr>
+            <w:r>
+              <w:rPr>
+                <w:rFonts w:ascii="Aptos Narrow" w:eastAsia="Times New Roman" w:hAnsi="Aptos Narrow" w:cs="Times New Roman"/>
+                <w:color w:val="000000"/>
+                <w:kern w:val="0"/>
+                <w:sz w:val="22"/>
+                <w:szCs w:val="22"/>
+                <w:lang w:eastAsia="pt-BR"/>
+                <w14:ligatures w14:val="none"/>
+              </w:rPr>
+              <w:t>Mudança de algum gráfico na Dashboard</w:t>
+            </w:r>
+          </w:p>
+        </w:tc>
+        <w:tc>
+          <w:tcPr>
+            <w:tcW w:w="1280" w:type="dxa"/>
+            <w:tcBorders>
+              <w:top w:val="single" w:sz="4" w:space="0" w:color="auto"/>
+              <w:left w:val="nil"/>
+              <w:bottom w:val="single" w:sz="4" w:space="0" w:color="auto"/>
+              <w:right w:val="single" w:sz="4" w:space="0" w:color="auto"/>
+            </w:tcBorders>
+            <w:shd w:val="clear" w:color="auto" w:fill="auto"/>
+            <w:noWrap/>
+            <w:vAlign w:val="center"/>
+            <w:hideMark/>
+          </w:tcPr>
+          <w:p>
+            <w:pPr>
+              <w:spacing w:after="0" w:line="240" w:lineRule="auto"/>
+              <w:ind w:firstLine="0"/>
+              <w:jc w:val="center"/>
+              <w:rPr>
+                <w:rFonts w:ascii="Aptos Narrow" w:eastAsia="Times New Roman" w:hAnsi="Aptos Narrow" w:cs="Times New Roman"/>
+                <w:color w:val="000000"/>
+                <w:kern w:val="0"/>
+                <w:sz w:val="22"/>
+                <w:szCs w:val="22"/>
+                <w:lang w:eastAsia="pt-BR"/>
+                <w14:ligatures w14:val="none"/>
+              </w:rPr>
+            </w:pPr>
+            <w:r>
+              <w:rPr>
+                <w:rFonts w:ascii="Aptos Narrow" w:eastAsia="Times New Roman" w:hAnsi="Aptos Narrow" w:cs="Times New Roman"/>
+                <w:color w:val="000000"/>
+                <w:kern w:val="0"/>
+                <w:sz w:val="22"/>
+                <w:szCs w:val="22"/>
+                <w:lang w:eastAsia="pt-BR"/>
+                <w14:ligatures w14:val="none"/>
+              </w:rPr>
+              <w:t>3</w:t>
+            </w:r>
+          </w:p>
+        </w:tc>
+        <w:tc>
+          <w:tcPr>
+            <w:tcW w:w="800" w:type="dxa"/>
+            <w:tcBorders>
+              <w:top w:val="single" w:sz="4" w:space="0" w:color="auto"/>
+              <w:left w:val="nil"/>
+              <w:bottom w:val="single" w:sz="4" w:space="0" w:color="auto"/>
+              <w:right w:val="single" w:sz="4" w:space="0" w:color="auto"/>
+            </w:tcBorders>
+            <w:shd w:val="clear" w:color="auto" w:fill="auto"/>
+            <w:noWrap/>
+            <w:vAlign w:val="center"/>
+            <w:hideMark/>
+          </w:tcPr>
+          <w:p>
+            <w:pPr>
+              <w:spacing w:after="0" w:line="240" w:lineRule="auto"/>
+              <w:ind w:firstLine="0"/>
+              <w:jc w:val="center"/>
+              <w:rPr>
+                <w:rFonts w:ascii="Aptos Narrow" w:eastAsia="Times New Roman" w:hAnsi="Aptos Narrow" w:cs="Times New Roman"/>
+                <w:color w:val="000000"/>
+                <w:kern w:val="0"/>
+                <w:sz w:val="22"/>
+                <w:szCs w:val="22"/>
+                <w:lang w:eastAsia="pt-BR"/>
+                <w14:ligatures w14:val="none"/>
+              </w:rPr>
+            </w:pPr>
+            <w:r>
+              <w:rPr>
+                <w:rFonts w:ascii="Aptos Narrow" w:eastAsia="Times New Roman" w:hAnsi="Aptos Narrow" w:cs="Times New Roman"/>
+                <w:color w:val="000000"/>
+                <w:kern w:val="0"/>
+                <w:sz w:val="22"/>
+                <w:szCs w:val="22"/>
+                <w:lang w:eastAsia="pt-BR"/>
+                <w14:ligatures w14:val="none"/>
+              </w:rPr>
+              <w:t>1</w:t>
+            </w:r>
+          </w:p>
+        </w:tc>
+        <w:tc>
+          <w:tcPr>
+            <w:tcW w:w="800" w:type="dxa"/>
+            <w:tcBorders>
+              <w:top w:val="single" w:sz="4" w:space="0" w:color="auto"/>
+              <w:left w:val="nil"/>
+              <w:bottom w:val="single" w:sz="4" w:space="0" w:color="auto"/>
+              <w:right w:val="single" w:sz="4" w:space="0" w:color="auto"/>
+            </w:tcBorders>
+            <w:shd w:val="clear" w:color="auto" w:fill="auto"/>
+            <w:noWrap/>
+            <w:vAlign w:val="center"/>
+            <w:hideMark/>
+          </w:tcPr>
+          <w:p>
+            <w:pPr>
+              <w:spacing w:after="0" w:line="240" w:lineRule="auto"/>
+              <w:ind w:firstLine="0"/>
+              <w:jc w:val="center"/>
+              <w:rPr>
+                <w:rFonts w:ascii="Aptos Narrow" w:eastAsia="Times New Roman" w:hAnsi="Aptos Narrow" w:cs="Times New Roman"/>
+                <w:color w:val="000000"/>
+                <w:kern w:val="0"/>
+                <w:sz w:val="22"/>
+                <w:szCs w:val="22"/>
+                <w:lang w:eastAsia="pt-BR"/>
+                <w14:ligatures w14:val="none"/>
+              </w:rPr>
+            </w:pPr>
+            <w:r>
+              <w:rPr>
+                <w:rFonts w:ascii="Aptos Narrow" w:eastAsia="Times New Roman" w:hAnsi="Aptos Narrow" w:cs="Times New Roman"/>
+                <w:color w:val="000000"/>
+                <w:kern w:val="0"/>
+                <w:sz w:val="22"/>
+                <w:szCs w:val="22"/>
+                <w:lang w:eastAsia="pt-BR"/>
+                <w14:ligatures w14:val="none"/>
+              </w:rPr>
+              <w:t>3</w:t>
+            </w:r>
+          </w:p>
+        </w:tc>
+        <w:tc>
+          <w:tcPr>
+            <w:tcW w:w="780" w:type="dxa"/>
+            <w:tcBorders>
+              <w:top w:val="nil"/>
+              <w:left w:val="nil"/>
+              <w:bottom w:val="single" w:sz="4" w:space="0" w:color="auto"/>
+              <w:right w:val="single" w:sz="4" w:space="0" w:color="auto"/>
+            </w:tcBorders>
+            <w:shd w:val="clear" w:color="auto" w:fill="auto"/>
+            <w:noWrap/>
+            <w:vAlign w:val="center"/>
+            <w:hideMark/>
+          </w:tcPr>
+          <w:p>
+            <w:pPr>
+              <w:spacing w:after="0" w:line="240" w:lineRule="auto"/>
+              <w:ind w:firstLine="0"/>
+              <w:jc w:val="center"/>
+              <w:rPr>
+                <w:rFonts w:ascii="Aptos Narrow" w:eastAsia="Times New Roman" w:hAnsi="Aptos Narrow" w:cs="Times New Roman"/>
+                <w:color w:val="000000"/>
+                <w:kern w:val="0"/>
+                <w:sz w:val="22"/>
+                <w:szCs w:val="22"/>
+                <w:lang w:eastAsia="pt-BR"/>
+                <w14:ligatures w14:val="none"/>
+              </w:rPr>
+            </w:pPr>
+            <w:r>
+              <w:rPr>
+                <w:rFonts w:ascii="Aptos Narrow" w:eastAsia="Times New Roman" w:hAnsi="Aptos Narrow" w:cs="Times New Roman"/>
+                <w:color w:val="000000"/>
+                <w:kern w:val="0"/>
+                <w:sz w:val="22"/>
+                <w:szCs w:val="22"/>
+                <w:lang w:eastAsia="pt-BR"/>
+                <w14:ligatures w14:val="none"/>
+              </w:rPr>
+              <w:t>Mitigar</w:t>
+            </w:r>
+          </w:p>
+        </w:tc>
+        <w:tc>
+          <w:tcPr>
+            <w:tcW w:w="2500" w:type="dxa"/>
+            <w:tcBorders>
+              <w:top w:val="single" w:sz="4" w:space="0" w:color="auto"/>
+              <w:left w:val="nil"/>
+              <w:bottom w:val="single" w:sz="4" w:space="0" w:color="auto"/>
+              <w:right w:val="single" w:sz="8" w:space="0" w:color="000000"/>
+            </w:tcBorders>
+            <w:shd w:val="clear" w:color="auto" w:fill="auto"/>
+            <w:vAlign w:val="center"/>
+            <w:hideMark/>
+          </w:tcPr>
+          <w:p>
+            <w:pPr>
+              <w:spacing w:after="0" w:line="240" w:lineRule="auto"/>
+              <w:ind w:firstLine="0"/>
+              <w:rPr>
+                <w:rFonts w:ascii="Aptos Narrow" w:eastAsia="Times New Roman" w:hAnsi="Aptos Narrow" w:cs="Times New Roman"/>
+                <w:color w:val="000000"/>
+                <w:kern w:val="0"/>
+                <w:sz w:val="22"/>
+                <w:szCs w:val="22"/>
+                <w:lang w:eastAsia="pt-BR"/>
+                <w14:ligatures w14:val="none"/>
+              </w:rPr>
+            </w:pPr>
+            <w:r>
+              <w:rPr>
+                <w:rFonts w:ascii="Aptos Narrow" w:eastAsia="Times New Roman" w:hAnsi="Aptos Narrow" w:cs="Times New Roman"/>
+                <w:color w:val="000000"/>
+                <w:kern w:val="0"/>
+                <w:sz w:val="22"/>
+                <w:szCs w:val="22"/>
+                <w:lang w:eastAsia="pt-BR"/>
+                <w14:ligatures w14:val="none"/>
+              </w:rPr>
+              <w:t>Informar previamente a equipe para manipulação de dados</w:t>
+            </w:r>
+          </w:p>
+        </w:tc>
+      </w:tr>
+      <w:tr>
+        <w:trPr>
+          <w:trHeight w:val="1044"/>
+        </w:trPr>
+        <w:tc>
+          <w:tcPr>
+            <w:tcW w:w="580" w:type="dxa"/>
+            <w:tcBorders>
+              <w:top w:val="nil"/>
+              <w:left w:val="single" w:sz="8" w:space="0" w:color="auto"/>
+              <w:bottom w:val="single" w:sz="8" w:space="0" w:color="auto"/>
+              <w:right w:val="single" w:sz="4" w:space="0" w:color="auto"/>
+            </w:tcBorders>
+            <w:shd w:val="clear" w:color="auto" w:fill="auto"/>
+            <w:noWrap/>
+            <w:vAlign w:val="center"/>
+            <w:hideMark/>
+          </w:tcPr>
+          <w:p>
+            <w:pPr>
+              <w:spacing w:after="0" w:line="240" w:lineRule="auto"/>
+              <w:ind w:firstLine="0"/>
+              <w:jc w:val="center"/>
+              <w:rPr>
+                <w:rFonts w:ascii="Aptos Narrow" w:eastAsia="Times New Roman" w:hAnsi="Aptos Narrow" w:cs="Times New Roman"/>
+                <w:color w:val="000000"/>
+                <w:kern w:val="0"/>
+                <w:sz w:val="22"/>
+                <w:szCs w:val="22"/>
+                <w:lang w:eastAsia="pt-BR"/>
+                <w14:ligatures w14:val="none"/>
+              </w:rPr>
+            </w:pPr>
+            <w:r>
+              <w:rPr>
+                <w:rFonts w:ascii="Aptos Narrow" w:eastAsia="Times New Roman" w:hAnsi="Aptos Narrow" w:cs="Times New Roman"/>
+                <w:color w:val="000000"/>
+                <w:kern w:val="0"/>
+                <w:sz w:val="22"/>
+                <w:szCs w:val="22"/>
+                <w:lang w:eastAsia="pt-BR"/>
+                <w14:ligatures w14:val="none"/>
+              </w:rPr>
+              <w:t>8</w:t>
+            </w:r>
+          </w:p>
+        </w:tc>
+        <w:tc>
+          <w:tcPr>
+            <w:tcW w:w="2320" w:type="dxa"/>
+            <w:tcBorders>
+              <w:top w:val="single" w:sz="4" w:space="0" w:color="auto"/>
+              <w:left w:val="nil"/>
+              <w:bottom w:val="single" w:sz="8" w:space="0" w:color="auto"/>
+              <w:right w:val="single" w:sz="4" w:space="0" w:color="auto"/>
+            </w:tcBorders>
+            <w:shd w:val="clear" w:color="auto" w:fill="auto"/>
+            <w:vAlign w:val="center"/>
+            <w:hideMark/>
+          </w:tcPr>
+          <w:p>
+            <w:pPr>
+              <w:spacing w:after="0" w:line="240" w:lineRule="auto"/>
+              <w:ind w:firstLine="0"/>
+              <w:jc w:val="left"/>
+              <w:rPr>
+                <w:rFonts w:ascii="Aptos Narrow" w:eastAsia="Times New Roman" w:hAnsi="Aptos Narrow" w:cs="Times New Roman"/>
+                <w:color w:val="000000"/>
+                <w:kern w:val="0"/>
+                <w:sz w:val="22"/>
+                <w:szCs w:val="22"/>
+                <w:lang w:eastAsia="pt-BR"/>
+                <w14:ligatures w14:val="none"/>
+              </w:rPr>
+            </w:pPr>
+            <w:r>
+              <w:rPr>
+                <w:rFonts w:ascii="Aptos Narrow" w:eastAsia="Times New Roman" w:hAnsi="Aptos Narrow" w:cs="Times New Roman"/>
+                <w:color w:val="000000"/>
+                <w:kern w:val="0"/>
+                <w:sz w:val="22"/>
+                <w:szCs w:val="22"/>
+                <w:lang w:eastAsia="pt-BR"/>
+                <w14:ligatures w14:val="none"/>
+              </w:rPr>
+              <w:t>Incompatibilidade dos elementos do site com navegador específico</w:t>
+            </w:r>
+          </w:p>
+        </w:tc>
+        <w:tc>
+          <w:tcPr>
+            <w:tcW w:w="1280" w:type="dxa"/>
+            <w:tcBorders>
+              <w:top w:val="single" w:sz="4" w:space="0" w:color="auto"/>
+              <w:left w:val="nil"/>
+              <w:bottom w:val="single" w:sz="8" w:space="0" w:color="auto"/>
+              <w:right w:val="single" w:sz="4" w:space="0" w:color="auto"/>
+            </w:tcBorders>
+            <w:shd w:val="clear" w:color="auto" w:fill="auto"/>
+            <w:noWrap/>
+            <w:vAlign w:val="center"/>
+            <w:hideMark/>
+          </w:tcPr>
+          <w:p>
+            <w:pPr>
+              <w:spacing w:after="0" w:line="240" w:lineRule="auto"/>
+              <w:ind w:firstLine="0"/>
+              <w:jc w:val="center"/>
+              <w:rPr>
+                <w:rFonts w:ascii="Aptos Narrow" w:eastAsia="Times New Roman" w:hAnsi="Aptos Narrow" w:cs="Times New Roman"/>
+                <w:color w:val="000000"/>
+                <w:kern w:val="0"/>
+                <w:sz w:val="22"/>
+                <w:szCs w:val="22"/>
+                <w:lang w:eastAsia="pt-BR"/>
+                <w14:ligatures w14:val="none"/>
+              </w:rPr>
+            </w:pPr>
+            <w:r>
+              <w:rPr>
+                <w:rFonts w:ascii="Aptos Narrow" w:eastAsia="Times New Roman" w:hAnsi="Aptos Narrow" w:cs="Times New Roman"/>
+                <w:color w:val="000000"/>
+                <w:kern w:val="0"/>
+                <w:sz w:val="22"/>
+                <w:szCs w:val="22"/>
+                <w:lang w:eastAsia="pt-BR"/>
+                <w14:ligatures w14:val="none"/>
+              </w:rPr>
+              <w:t>3</w:t>
+            </w:r>
+          </w:p>
+        </w:tc>
+        <w:tc>
+          <w:tcPr>
+            <w:tcW w:w="800" w:type="dxa"/>
+            <w:tcBorders>
+              <w:top w:val="single" w:sz="4" w:space="0" w:color="auto"/>
+              <w:left w:val="nil"/>
+              <w:bottom w:val="single" w:sz="8" w:space="0" w:color="auto"/>
+              <w:right w:val="single" w:sz="4" w:space="0" w:color="auto"/>
+            </w:tcBorders>
+            <w:shd w:val="clear" w:color="auto" w:fill="auto"/>
+            <w:noWrap/>
+            <w:vAlign w:val="center"/>
+            <w:hideMark/>
+          </w:tcPr>
+          <w:p>
+            <w:pPr>
+              <w:spacing w:after="0" w:line="240" w:lineRule="auto"/>
+              <w:ind w:firstLine="0"/>
+              <w:jc w:val="center"/>
+              <w:rPr>
+                <w:rFonts w:ascii="Aptos Narrow" w:eastAsia="Times New Roman" w:hAnsi="Aptos Narrow" w:cs="Times New Roman"/>
+                <w:color w:val="000000"/>
+                <w:kern w:val="0"/>
+                <w:sz w:val="22"/>
+                <w:szCs w:val="22"/>
+                <w:lang w:eastAsia="pt-BR"/>
+                <w14:ligatures w14:val="none"/>
+              </w:rPr>
+            </w:pPr>
+            <w:r>
+              <w:rPr>
+                <w:rFonts w:ascii="Aptos Narrow" w:eastAsia="Times New Roman" w:hAnsi="Aptos Narrow" w:cs="Times New Roman"/>
+                <w:color w:val="000000"/>
+                <w:kern w:val="0"/>
+                <w:sz w:val="22"/>
+                <w:szCs w:val="22"/>
+                <w:lang w:eastAsia="pt-BR"/>
+                <w14:ligatures w14:val="none"/>
+              </w:rPr>
+              <w:t>1</w:t>
+            </w:r>
+          </w:p>
+        </w:tc>
+        <w:tc>
+          <w:tcPr>
+            <w:tcW w:w="800" w:type="dxa"/>
+            <w:tcBorders>
+              <w:top w:val="single" w:sz="4" w:space="0" w:color="auto"/>
+              <w:left w:val="nil"/>
+              <w:bottom w:val="single" w:sz="8" w:space="0" w:color="auto"/>
+              <w:right w:val="single" w:sz="4" w:space="0" w:color="auto"/>
+            </w:tcBorders>
+            <w:shd w:val="clear" w:color="auto" w:fill="auto"/>
+            <w:noWrap/>
+            <w:vAlign w:val="center"/>
+            <w:hideMark/>
+          </w:tcPr>
+          <w:p>
+            <w:pPr>
+              <w:spacing w:after="0" w:line="240" w:lineRule="auto"/>
+              <w:ind w:firstLine="0"/>
+              <w:jc w:val="center"/>
+              <w:rPr>
+                <w:rFonts w:ascii="Aptos Narrow" w:eastAsia="Times New Roman" w:hAnsi="Aptos Narrow" w:cs="Times New Roman"/>
+                <w:color w:val="000000"/>
+                <w:kern w:val="0"/>
+                <w:sz w:val="22"/>
+                <w:szCs w:val="22"/>
+                <w:lang w:eastAsia="pt-BR"/>
+                <w14:ligatures w14:val="none"/>
+              </w:rPr>
+            </w:pPr>
+            <w:r>
+              <w:rPr>
+                <w:rFonts w:ascii="Aptos Narrow" w:eastAsia="Times New Roman" w:hAnsi="Aptos Narrow" w:cs="Times New Roman"/>
+                <w:color w:val="000000"/>
+                <w:kern w:val="0"/>
+                <w:sz w:val="22"/>
+                <w:szCs w:val="22"/>
+                <w:lang w:eastAsia="pt-BR"/>
+                <w14:ligatures w14:val="none"/>
+              </w:rPr>
+              <w:t>3</w:t>
+            </w:r>
+          </w:p>
+        </w:tc>
+        <w:tc>
+          <w:tcPr>
+            <w:tcW w:w="780" w:type="dxa"/>
+            <w:tcBorders>
+              <w:top w:val="nil"/>
+              <w:left w:val="nil"/>
+              <w:bottom w:val="single" w:sz="8" w:space="0" w:color="auto"/>
+              <w:right w:val="single" w:sz="4" w:space="0" w:color="auto"/>
+            </w:tcBorders>
+            <w:shd w:val="clear" w:color="auto" w:fill="auto"/>
+            <w:noWrap/>
+            <w:vAlign w:val="center"/>
+            <w:hideMark/>
+          </w:tcPr>
+          <w:p>
+            <w:pPr>
+              <w:spacing w:after="0" w:line="240" w:lineRule="auto"/>
+              <w:ind w:firstLine="0"/>
+              <w:jc w:val="center"/>
+              <w:rPr>
+                <w:rFonts w:ascii="Aptos Narrow" w:eastAsia="Times New Roman" w:hAnsi="Aptos Narrow" w:cs="Times New Roman"/>
+                <w:color w:val="000000"/>
+                <w:kern w:val="0"/>
+                <w:sz w:val="22"/>
+                <w:szCs w:val="22"/>
+                <w:lang w:eastAsia="pt-BR"/>
+                <w14:ligatures w14:val="none"/>
+              </w:rPr>
+            </w:pPr>
+            <w:r>
+              <w:rPr>
+                <w:rFonts w:ascii="Aptos Narrow" w:eastAsia="Times New Roman" w:hAnsi="Aptos Narrow" w:cs="Times New Roman"/>
+                <w:color w:val="000000"/>
+                <w:kern w:val="0"/>
+                <w:sz w:val="22"/>
+                <w:szCs w:val="22"/>
+                <w:lang w:eastAsia="pt-BR"/>
+                <w14:ligatures w14:val="none"/>
+              </w:rPr>
+              <w:t>Mitigar</w:t>
+            </w:r>
+          </w:p>
+        </w:tc>
+        <w:tc>
+          <w:tcPr>
+            <w:tcW w:w="2500" w:type="dxa"/>
+            <w:tcBorders>
+              <w:top w:val="single" w:sz="4" w:space="0" w:color="auto"/>
+              <w:left w:val="nil"/>
+              <w:bottom w:val="single" w:sz="8" w:space="0" w:color="auto"/>
+              <w:right w:val="single" w:sz="8" w:space="0" w:color="000000"/>
+            </w:tcBorders>
+            <w:shd w:val="clear" w:color="auto" w:fill="auto"/>
+            <w:vAlign w:val="center"/>
+            <w:hideMark/>
+          </w:tcPr>
+          <w:p>
+            <w:pPr>
+              <w:spacing w:after="0" w:line="240" w:lineRule="auto"/>
+              <w:ind w:firstLine="0"/>
+              <w:rPr>
+                <w:rFonts w:ascii="Aptos Narrow" w:eastAsia="Times New Roman" w:hAnsi="Aptos Narrow" w:cs="Times New Roman"/>
+                <w:color w:val="000000"/>
+                <w:kern w:val="0"/>
+                <w:sz w:val="22"/>
+                <w:szCs w:val="22"/>
+                <w:lang w:eastAsia="pt-BR"/>
+                <w14:ligatures w14:val="none"/>
+              </w:rPr>
+            </w:pPr>
+            <w:r>
+              <w:rPr>
+                <w:rFonts w:ascii="Aptos Narrow" w:eastAsia="Times New Roman" w:hAnsi="Aptos Narrow" w:cs="Times New Roman"/>
+                <w:color w:val="000000"/>
+                <w:kern w:val="0"/>
+                <w:sz w:val="22"/>
+                <w:szCs w:val="22"/>
+                <w:lang w:eastAsia="pt-BR"/>
+                <w14:ligatures w14:val="none"/>
+              </w:rPr>
+              <w:t>Recomendar o uso de um navegador específico</w:t>
+            </w:r>
+          </w:p>
+        </w:tc>
+      </w:tr>
+    </w:tbl>
+    <w:p/>
+    <w:p>
+      <w:pPr>
+        <w:spacing w:line="278" w:lineRule="auto"/>
+        <w:ind w:firstLine="0"/>
+        <w:jc w:val="left"/>
+        <w:rPr>
+          <w:rFonts w:eastAsiaTheme="majorEastAsia" w:cstheme="majorBidi"/>
+          <w:b/>
+          <w:caps/>
+          <w:color w:val="000000" w:themeColor="text1"/>
+          <w:szCs w:val="40"/>
+        </w:rPr>
+      </w:pPr>
+      <w:r>
+        <w:br w:type="page"/>
+      </w:r>
+    </w:p>
+    <w:p>
+      <w:pPr>
+        <w:pStyle w:val="Ttulo1"/>
+      </w:pPr>
+      <w:r>
+        <w:lastRenderedPageBreak/>
         <w:t>Referências</w:t>
       </w:r>
     </w:p>
@@ -6970,21 +9864,7 @@
           <w:b/>
           <w:bCs/>
         </w:rPr>
-        <w:t>E-commerce no Brasil cresce 4% e alcança R$ 196 bi em 2023 — Ministério do</w:t>
-      </w:r>
-      <w:r>
-        <w:rPr>
-          <w:b/>
-          <w:bCs/>
-        </w:rPr>
-        <w:t xml:space="preserve"> </w:t>
-      </w:r>
-      <w:r>
-        <w:rPr>
-          <w:b/>
-          <w:bCs/>
-        </w:rPr>
-        <w:t xml:space="preserve">Desenvolvimento, Indústria, Comércio e Serviços </w:t>
+        <w:t xml:space="preserve">E-commerce no Brasil cresce 4% e alcança R$ 196 bi em 2023 — Ministério do Desenvolvimento, Indústria, Comércio e Serviços </w:t>
       </w:r>
     </w:p>
     <w:p>
@@ -7143,7 +10023,7 @@
 </file>
 
 <file path=word/numbering.xml><?xml version="1.0" encoding="utf-8"?>
-<w:numbering xmlns:wpc="http://schemas.microsoft.com/office/word/2010/wordprocessingCanvas" xmlns:cx="http://schemas.microsoft.com/office/drawing/2014/chartex" xmlns:cx1="http://schemas.microsoft.com/office/drawing/2015/9/8/chartex" xmlns:cx2="http://schemas.microsoft.com/office/drawing/2015/10/21/chartex" xmlns:cx3="http://schemas.microsoft.com/office/drawing/2016/5/9/chartex" xmlns:cx4="http://schemas.microsoft.com/office/drawing/2016/5/10/chartex" xmlns:cx5="http://schemas.microsoft.com/office/drawing/2016/5/11/chartex" xmlns:cx6="http://schemas.microsoft.com/office/drawing/2016/5/12/chartex" xmlns:cx7="http://schemas.microsoft.com/office/drawing/2016/5/13/chartex" xmlns:cx8="http://schemas.microsoft.com/office/drawing/2016/5/14/chartex" xmlns:mc="http://schemas.openxmlformats.org/markup-compatibility/2006" xmlns:aink="http://schemas.microsoft.com/office/drawing/2016/ink" xmlns:am3d="http://schemas.microsoft.com/office/drawing/2017/model3d" xmlns:o="urn:schemas-microsoft-com:office:office" xmlns:oel="http://schemas.microsoft.com/office/2019/extlst" xmlns:r="http://schemas.openxmlformats.org/officeDocument/2006/relationships" xmlns:m="http://schemas.openxmlformats.org/officeDocument/2006/math" xmlns:v="urn:schemas-microsoft-com:vml" xmlns:wp14="http://schemas.microsoft.com/office/word/2010/wordprocessingDrawing" xmlns:wp="http://schemas.openxmlformats.org/drawingml/2006/wordprocessingDrawing" xmlns:w10="urn:schemas-microsoft-com:office:word" xmlns:w="http://schemas.openxmlformats.org/wordprocessingml/2006/main" xmlns:w14="http://schemas.microsoft.com/office/word/2010/wordml" xmlns:w15="http://schemas.microsoft.com/office/word/2012/wordml" xmlns:w16cex="http://schemas.microsoft.com/office/word/2018/wordml/cex" xmlns:w16cid="http://schemas.microsoft.com/office/word/2016/wordml/cid" xmlns:w16="http://schemas.microsoft.com/office/word/2018/wordml" xmlns:w16du="http://schemas.microsoft.com/office/word/2023/wordml/word16du" xmlns:w16sdtdh="http://schemas.microsoft.com/office/word/2020/wordml/sdtdatahash" xmlns:w16sdtfl="http://schemas.microsoft.com/office/word/2024/wordml/sdtformatlock" xmlns:w16se="http://schemas.microsoft.com/office/word/2015/wordml/symex" xmlns:wpg="http://schemas.microsoft.com/office/word/2010/wordprocessingGroup" xmlns:wpi="http://schemas.microsoft.com/office/word/2010/wordprocessingInk" xmlns:wne="http://schemas.microsoft.com/office/word/2006/wordml" xmlns:wps="http://schemas.microsoft.com/office/word/2010/wordprocessingShape" mc:Ignorable="w14 w15 w16se w16cid w16 w16cex w16sdtdh w16sdtfl w16du wp14">
+<w:numbering xmlns:wpc="http://schemas.microsoft.com/office/word/2010/wordprocessingCanvas" xmlns:cx="http://schemas.microsoft.com/office/drawing/2014/chartex" xmlns:cx1="http://schemas.microsoft.com/office/drawing/2015/9/8/chartex" xmlns:cx2="http://schemas.microsoft.com/office/drawing/2015/10/21/chartex" xmlns:cx3="http://schemas.microsoft.com/office/drawing/2016/5/9/chartex" xmlns:cx4="http://schemas.microsoft.com/office/drawing/2016/5/10/chartex" xmlns:cx5="http://schemas.microsoft.com/office/drawing/2016/5/11/chartex" xmlns:cx6="http://schemas.microsoft.com/office/drawing/2016/5/12/chartex" xmlns:cx7="http://schemas.microsoft.com/office/drawing/2016/5/13/chartex" xmlns:cx8="http://schemas.microsoft.com/office/drawing/2016/5/14/chartex" xmlns:mc="http://schemas.openxmlformats.org/markup-compatibility/2006" xmlns:aink="http://schemas.microsoft.com/office/drawing/2016/ink" xmlns:am3d="http://schemas.microsoft.com/office/drawing/2017/model3d" xmlns:o="urn:schemas-microsoft-com:office:office" xmlns:oel="http://schemas.microsoft.com/office/2019/extlst" xmlns:r="http://schemas.openxmlformats.org/officeDocument/2006/relationships" xmlns:m="http://schemas.openxmlformats.org/officeDocument/2006/math" xmlns:v="urn:schemas-microsoft-com:vml" xmlns:wp14="http://schemas.microsoft.com/office/word/2010/wordprocessingDrawing" xmlns:wp="http://schemas.openxmlformats.org/drawingml/2006/wordprocessingDrawing" xmlns:w10="urn:schemas-microsoft-com:office:word" xmlns:w="http://schemas.openxmlformats.org/wordprocessingml/2006/main" xmlns:w14="http://schemas.microsoft.com/office/word/2010/wordml" xmlns:w15="http://schemas.microsoft.com/office/word/2012/wordml" xmlns:w16cex="http://schemas.microsoft.com/office/word/2018/wordml/cex" xmlns:w16cid="http://schemas.microsoft.com/office/word/2016/wordml/cid" xmlns:w16="http://schemas.microsoft.com/office/word/2018/wordml" xmlns:w16sdtdh="http://schemas.microsoft.com/office/word/2020/wordml/sdtdatahash" xmlns:w16se="http://schemas.microsoft.com/office/word/2015/wordml/symex" xmlns:wpg="http://schemas.microsoft.com/office/word/2010/wordprocessingGroup" xmlns:wpi="http://schemas.microsoft.com/office/word/2010/wordprocessingInk" xmlns:wne="http://schemas.microsoft.com/office/word/2006/wordml" xmlns:wps="http://schemas.microsoft.com/office/word/2010/wordprocessingShape" mc:Ignorable="w14 w15 w16se w16cid w16 w16cex w16sdtdh wp14">
   <w:abstractNum w:abstractNumId="0" w15:restartNumberingAfterBreak="0">
     <w:nsid w:val="09F063C8"/>
     <w:multiLevelType w:val="multilevel"/>
@@ -8183,33 +11063,15 @@
   </w:num>
   <w:num w:numId="17" w16cid:durableId="1688363144">
     <w:abstractNumId w:val="2"/>
-    <w:lvlOverride w:ilvl="0"/>
-    <w:lvlOverride w:ilvl="1"/>
-    <w:lvlOverride w:ilvl="2"/>
-    <w:lvlOverride w:ilvl="3"/>
-    <w:lvlOverride w:ilvl="4"/>
-    <w:lvlOverride w:ilvl="5"/>
-    <w:lvlOverride w:ilvl="6"/>
-    <w:lvlOverride w:ilvl="7"/>
-    <w:lvlOverride w:ilvl="8"/>
   </w:num>
   <w:num w:numId="18" w16cid:durableId="1780829771">
     <w:abstractNumId w:val="0"/>
-    <w:lvlOverride w:ilvl="0"/>
-    <w:lvlOverride w:ilvl="1"/>
-    <w:lvlOverride w:ilvl="2"/>
-    <w:lvlOverride w:ilvl="3"/>
-    <w:lvlOverride w:ilvl="4"/>
-    <w:lvlOverride w:ilvl="5"/>
-    <w:lvlOverride w:ilvl="6"/>
-    <w:lvlOverride w:ilvl="7"/>
-    <w:lvlOverride w:ilvl="8"/>
   </w:num>
 </w:numbering>
 </file>
 
 <file path=word/styles.xml><?xml version="1.0" encoding="utf-8"?>
-<w:styles xmlns:mc="http://schemas.openxmlformats.org/markup-compatibility/2006" xmlns:r="http://schemas.openxmlformats.org/officeDocument/2006/relationships" xmlns:w="http://schemas.openxmlformats.org/wordprocessingml/2006/main" xmlns:w14="http://schemas.microsoft.com/office/word/2010/wordml" xmlns:w15="http://schemas.microsoft.com/office/word/2012/wordml" xmlns:w16cex="http://schemas.microsoft.com/office/word/2018/wordml/cex" xmlns:w16cid="http://schemas.microsoft.com/office/word/2016/wordml/cid" xmlns:w16="http://schemas.microsoft.com/office/word/2018/wordml" xmlns:w16du="http://schemas.microsoft.com/office/word/2023/wordml/word16du" xmlns:w16sdtdh="http://schemas.microsoft.com/office/word/2020/wordml/sdtdatahash" xmlns:w16sdtfl="http://schemas.microsoft.com/office/word/2024/wordml/sdtformatlock" xmlns:w16se="http://schemas.microsoft.com/office/word/2015/wordml/symex" mc:Ignorable="w14 w15 w16se w16cid w16 w16cex w16sdtdh w16sdtfl w16du">
+<w:styles xmlns:mc="http://schemas.openxmlformats.org/markup-compatibility/2006" xmlns:r="http://schemas.openxmlformats.org/officeDocument/2006/relationships" xmlns:w="http://schemas.openxmlformats.org/wordprocessingml/2006/main" xmlns:w14="http://schemas.microsoft.com/office/word/2010/wordml" xmlns:w15="http://schemas.microsoft.com/office/word/2012/wordml" xmlns:w16cex="http://schemas.microsoft.com/office/word/2018/wordml/cex" xmlns:w16cid="http://schemas.microsoft.com/office/word/2016/wordml/cid" xmlns:w16="http://schemas.microsoft.com/office/word/2018/wordml" xmlns:w16sdtdh="http://schemas.microsoft.com/office/word/2020/wordml/sdtdatahash" xmlns:w16se="http://schemas.microsoft.com/office/word/2015/wordml/symex" mc:Ignorable="w14 w15 w16se w16cid w16 w16cex w16sdtdh">
   <w:docDefaults>
     <w:rPrDefault>
       <w:rPr>
@@ -8854,6 +11716,7 @@
   <w:style w:type="character" w:default="1" w:styleId="Fontepargpadro">
     <w:name w:val="Default Paragraph Font"/>
     <w:uiPriority w:val="1"/>
+    <w:semiHidden/>
     <w:unhideWhenUsed/>
   </w:style>
   <w:style w:type="table" w:default="1" w:styleId="Tabelanormal">

</xml_diff>

<commit_message>
Adicionando section produtos e footer
</commit_message>
<xml_diff>
--- a/TI/FlowIT.docx
+++ b/TI/FlowIT.docx
@@ -1492,15 +1492,13 @@
     </w:p>
     <w:p>
       <w:r>
-        <w:t xml:space="preserve">Atualmente, o comércio físico no Brasil enfrenta forte concorrência do e </w:t>
+        <w:t>Atualmente, o comércio físico no Brasil enfrenta forte concorrência do e</w:t>
       </w:r>
-      <w:proofErr w:type="spellStart"/>
       <w:r>
-        <w:t>commerce</w:t>
+        <w:t>-</w:t>
       </w:r>
-      <w:proofErr w:type="spellEnd"/>
       <w:r>
-        <w:t xml:space="preserve">, que em 2023 faturou R$196,1 bilhões (alta de 4,8% em relação ao ano anterior). Mesmo com essa disputa, pesquisas indicam que grande parte das decisões de compra ainda ocorre no ponto de venda físico. Entender o comportamento dos clientes dentro da loja é, portanto, essencial. Segundo a McKinsey &amp; </w:t>
+        <w:t xml:space="preserve">commerce, que em 2023 faturou R$196,1 bilhões (alta de 4,8% em relação ao ano anterior). Mesmo com essa disputa, pesquisas indicam que grande parte das decisões de compra ainda ocorre no ponto de venda físico. Entender o comportamento dos clientes dentro da loja é, portanto, essencial. Segundo a McKinsey &amp; </w:t>
       </w:r>
       <w:proofErr w:type="spellStart"/>
       <w:r>
@@ -1546,6 +1544,12 @@
       </w:r>
     </w:p>
     <w:p>
+      <w:pPr>
+        <w:rPr>
+          <w:kern w:val="0"/>
+          <w14:ligatures w14:val="none"/>
+        </w:rPr>
+      </w:pPr>
       <w:r>
         <w:rPr>
           <w:kern w:val="0"/>

</xml_diff>